<commit_message>
add by main stable no date
</commit_message>
<xml_diff>
--- a/amir_adv/adv_docs/forms_tabu-007.docx
+++ b/amir_adv/adv_docs/forms_tabu-007.docx
@@ -1,6 +1,6 @@
 
 <file path=word/document.xml><?xml version="1.0" encoding="utf-8"?>
-<w:document xmlns:wpc="http://schemas.microsoft.com/office/word/2010/wordprocessingCanvas" xmlns:cx="http://schemas.microsoft.com/office/drawing/2014/chartex" xmlns:cx1="http://schemas.microsoft.com/office/drawing/2015/9/8/chartex" xmlns:mc="http://schemas.openxmlformats.org/markup-compatibility/2006" xmlns:o="urn:schemas-microsoft-com:office:office" xmlns:r="http://schemas.openxmlformats.org/officeDocument/2006/relationships" xmlns:m="http://schemas.openxmlformats.org/officeDocument/2006/math" xmlns:v="urn:schemas-microsoft-com:vml" xmlns:wp14="http://schemas.microsoft.com/office/word/2010/wordprocessingDrawing" xmlns:wp="http://schemas.openxmlformats.org/drawingml/2006/wordprocessingDrawing" xmlns:w10="urn:schemas-microsoft-com:office:word" xmlns:w="http://schemas.openxmlformats.org/wordprocessingml/2006/main" xmlns:w14="http://schemas.microsoft.com/office/word/2010/wordml" xmlns:w15="http://schemas.microsoft.com/office/word/2012/wordml" xmlns:w16se="http://schemas.microsoft.com/office/word/2015/wordml/symex" xmlns:wpg="http://schemas.microsoft.com/office/word/2010/wordprocessingGroup" xmlns:wpi="http://schemas.microsoft.com/office/word/2010/wordprocessingInk" xmlns:wne="http://schemas.microsoft.com/office/word/2006/wordml" xmlns:wps="http://schemas.microsoft.com/office/word/2010/wordprocessingShape" mc:Ignorable="w14 w15 w16se wp14">
+<w:document xmlns:wpc="http://schemas.microsoft.com/office/word/2010/wordprocessingCanvas" xmlns:cx="http://schemas.microsoft.com/office/drawing/2014/chartex" xmlns:cx1="http://schemas.microsoft.com/office/drawing/2015/9/8/chartex" xmlns:cx2="http://schemas.microsoft.com/office/drawing/2015/10/21/chartex" xmlns:cx3="http://schemas.microsoft.com/office/drawing/2016/5/9/chartex" xmlns:cx4="http://schemas.microsoft.com/office/drawing/2016/5/10/chartex" xmlns:cx5="http://schemas.microsoft.com/office/drawing/2016/5/11/chartex" xmlns:cx6="http://schemas.microsoft.com/office/drawing/2016/5/12/chartex" xmlns:cx7="http://schemas.microsoft.com/office/drawing/2016/5/13/chartex" xmlns:cx8="http://schemas.microsoft.com/office/drawing/2016/5/14/chartex" xmlns:mc="http://schemas.openxmlformats.org/markup-compatibility/2006" xmlns:aink="http://schemas.microsoft.com/office/drawing/2016/ink" xmlns:am3d="http://schemas.microsoft.com/office/drawing/2017/model3d" xmlns:o="urn:schemas-microsoft-com:office:office" xmlns:oel="http://schemas.microsoft.com/office/2019/extlst" xmlns:r="http://schemas.openxmlformats.org/officeDocument/2006/relationships" xmlns:m="http://schemas.openxmlformats.org/officeDocument/2006/math" xmlns:v="urn:schemas-microsoft-com:vml" xmlns:wp14="http://schemas.microsoft.com/office/word/2010/wordprocessingDrawing" xmlns:wp="http://schemas.openxmlformats.org/drawingml/2006/wordprocessingDrawing" xmlns:w10="urn:schemas-microsoft-com:office:word" xmlns:w="http://schemas.openxmlformats.org/wordprocessingml/2006/main" xmlns:w14="http://schemas.microsoft.com/office/word/2010/wordml" xmlns:w15="http://schemas.microsoft.com/office/word/2012/wordml" xmlns:w16cex="http://schemas.microsoft.com/office/word/2018/wordml/cex" xmlns:w16cid="http://schemas.microsoft.com/office/word/2016/wordml/cid" xmlns:w16="http://schemas.microsoft.com/office/word/2018/wordml" xmlns:w16sdtdh="http://schemas.microsoft.com/office/word/2020/wordml/sdtdatahash" xmlns:w16se="http://schemas.microsoft.com/office/word/2015/wordml/symex" xmlns:wpg="http://schemas.microsoft.com/office/word/2010/wordprocessingGroup" xmlns:wpi="http://schemas.microsoft.com/office/word/2010/wordprocessingInk" xmlns:wne="http://schemas.microsoft.com/office/word/2006/wordml" xmlns:wps="http://schemas.microsoft.com/office/word/2010/wordprocessingShape" mc:Ignorable="w14 w15 w16se w16cid w16 w16cex w16sdtdh wp14">
   <w:body>
     <w:p>
       <w:pPr>
@@ -188,6 +188,7 @@
                 <w:bCs/>
                 <w:sz w:val="24"/>
                 <w:szCs w:val="24"/>
+                <w:rtl/>
                 <w:lang w:eastAsia="he-IL"/>
               </w:rPr>
             </w:pPr>
@@ -270,7 +271,7 @@
             </w:r>
             <w:r>
               <w:rPr>
-                <w:rFonts w:ascii="Cambria Math" w:eastAsia="Times New Roman" w:hAnsi="Cambria Math" w:cs="Cambria Math" w:hint="cs"/>
+                <w:rFonts w:ascii="Times New Roman" w:eastAsia="Times New Roman" w:hAnsi="Times New Roman" w:cs="David"/>
                 <w:b/>
                 <w:bCs/>
                 <w:sz w:val="24"/>
@@ -282,7 +283,7 @@
             </w:r>
             <w:r>
               <w:rPr>
-                <w:rFonts w:ascii="Cambria Math" w:eastAsia="Times New Roman" w:hAnsi="Cambria Math" w:cs="Cambria Math" w:hint="cs"/>
+                <w:rFonts w:ascii="Times New Roman" w:eastAsia="Times New Roman" w:hAnsi="Times New Roman" w:cs="David"/>
                 <w:b/>
                 <w:bCs/>
                 <w:sz w:val="24"/>
@@ -294,7 +295,7 @@
             </w:r>
             <w:r>
               <w:rPr>
-                <w:rFonts w:ascii="Cambria Math" w:eastAsia="Times New Roman" w:hAnsi="Cambria Math" w:cs="Cambria Math" w:hint="cs"/>
+                <w:rFonts w:ascii="Times New Roman" w:eastAsia="Times New Roman" w:hAnsi="Times New Roman" w:cs="David"/>
                 <w:b/>
                 <w:bCs/>
                 <w:sz w:val="24"/>
@@ -306,7 +307,7 @@
             </w:r>
             <w:r>
               <w:rPr>
-                <w:rFonts w:ascii="Cambria Math" w:eastAsia="Times New Roman" w:hAnsi="Cambria Math" w:cs="Cambria Math" w:hint="cs"/>
+                <w:rFonts w:ascii="Times New Roman" w:eastAsia="Times New Roman" w:hAnsi="Times New Roman" w:cs="David"/>
                 <w:b/>
                 <w:bCs/>
                 <w:sz w:val="24"/>
@@ -318,7 +319,7 @@
             </w:r>
             <w:r>
               <w:rPr>
-                <w:rFonts w:ascii="Cambria Math" w:eastAsia="Times New Roman" w:hAnsi="Cambria Math" w:cs="Cambria Math" w:hint="cs"/>
+                <w:rFonts w:ascii="Times New Roman" w:eastAsia="Times New Roman" w:hAnsi="Times New Roman" w:cs="David"/>
                 <w:b/>
                 <w:bCs/>
                 <w:sz w:val="24"/>
@@ -482,7 +483,7 @@
     </w:p>
     <w:p>
       <w:pPr>
-        <w:pStyle w:val="1"/>
+        <w:pStyle w:val="Heading1"/>
         <w:rPr>
           <w:rtl/>
         </w:rPr>
@@ -732,7 +733,7 @@
                   <w:checkBox>
                     <w:size w:val="26"/>
                     <w:default w:val="0"/>
-                    <w:checked w:val="0"/>
+                    <w:checked/>
                   </w:checkBox>
                 </w:ffData>
               </w:fldChar>
@@ -5994,48 +5995,12 @@
             </w:r>
             <w:r>
               <w:rPr>
-                <w:rFonts w:ascii="Times New Roman" w:eastAsia="Times New Roman" w:hAnsi="Times New Roman" w:cs="David"/>
-                <w:noProof/>
-                <w:rtl/>
-                <w:lang w:eastAsia="he-IL"/>
-              </w:rPr>
-              <w:t> </w:t>
-            </w:r>
-            <w:r>
-              <w:rPr>
-                <w:rFonts w:ascii="Times New Roman" w:eastAsia="Times New Roman" w:hAnsi="Times New Roman" w:cs="David"/>
-                <w:noProof/>
-                <w:rtl/>
-                <w:lang w:eastAsia="he-IL"/>
-              </w:rPr>
-              <w:t> </w:t>
-            </w:r>
-            <w:r>
-              <w:rPr>
-                <w:rFonts w:ascii="Times New Roman" w:eastAsia="Times New Roman" w:hAnsi="Times New Roman" w:cs="David"/>
-                <w:noProof/>
-                <w:rtl/>
-                <w:lang w:eastAsia="he-IL"/>
-              </w:rPr>
-              <w:t> </w:t>
-            </w:r>
-            <w:r>
-              <w:rPr>
-                <w:rFonts w:ascii="Times New Roman" w:eastAsia="Times New Roman" w:hAnsi="Times New Roman" w:cs="David"/>
-                <w:noProof/>
-                <w:rtl/>
-                <w:lang w:eastAsia="he-IL"/>
-              </w:rPr>
-              <w:t> </w:t>
-            </w:r>
-            <w:r>
-              <w:rPr>
-                <w:rFonts w:ascii="Times New Roman" w:eastAsia="Times New Roman" w:hAnsi="Times New Roman" w:cs="David"/>
-                <w:noProof/>
-                <w:rtl/>
-                <w:lang w:eastAsia="he-IL"/>
-              </w:rPr>
-              <w:t> </w:t>
+                <w:rFonts w:ascii="Times New Roman" w:eastAsia="Times New Roman" w:hAnsi="Times New Roman" w:cs="David" w:hint="cs"/>
+                <w:noProof/>
+                <w:rtl/>
+                <w:lang w:eastAsia="he-IL"/>
+              </w:rPr>
+              <w:t xml:space="preserve">המוכר </w:t>
             </w:r>
             <w:r>
               <w:rPr>
@@ -6158,48 +6123,12 @@
             </w:r>
             <w:r>
               <w:rPr>
-                <w:rFonts w:ascii="Times New Roman" w:eastAsia="Times New Roman" w:hAnsi="Times New Roman" w:cs="David"/>
-                <w:noProof/>
-                <w:rtl/>
-                <w:lang w:eastAsia="he-IL"/>
-              </w:rPr>
-              <w:t> </w:t>
-            </w:r>
-            <w:r>
-              <w:rPr>
-                <w:rFonts w:ascii="Times New Roman" w:eastAsia="Times New Roman" w:hAnsi="Times New Roman" w:cs="David"/>
-                <w:noProof/>
-                <w:rtl/>
-                <w:lang w:eastAsia="he-IL"/>
-              </w:rPr>
-              <w:t> </w:t>
-            </w:r>
-            <w:r>
-              <w:rPr>
-                <w:rFonts w:ascii="Times New Roman" w:eastAsia="Times New Roman" w:hAnsi="Times New Roman" w:cs="David"/>
-                <w:noProof/>
-                <w:rtl/>
-                <w:lang w:eastAsia="he-IL"/>
-              </w:rPr>
-              <w:t> </w:t>
-            </w:r>
-            <w:r>
-              <w:rPr>
-                <w:rFonts w:ascii="Times New Roman" w:eastAsia="Times New Roman" w:hAnsi="Times New Roman" w:cs="David"/>
-                <w:noProof/>
-                <w:rtl/>
-                <w:lang w:eastAsia="he-IL"/>
-              </w:rPr>
-              <w:t> </w:t>
-            </w:r>
-            <w:r>
-              <w:rPr>
-                <w:rFonts w:ascii="Times New Roman" w:eastAsia="Times New Roman" w:hAnsi="Times New Roman" w:cs="David"/>
-                <w:noProof/>
-                <w:rtl/>
-                <w:lang w:eastAsia="he-IL"/>
-              </w:rPr>
-              <w:t> </w:t>
+                <w:rFonts w:ascii="Times New Roman" w:eastAsia="Times New Roman" w:hAnsi="Times New Roman" w:cs="David" w:hint="cs"/>
+                <w:noProof/>
+                <w:rtl/>
+                <w:lang w:eastAsia="he-IL"/>
+              </w:rPr>
+              <w:t>הקונה</w:t>
             </w:r>
             <w:r>
               <w:rPr>
@@ -8428,7 +8357,6 @@
               </w:rPr>
               <w:fldChar w:fldCharType="separate"/>
             </w:r>
-            <w:bookmarkStart w:id="9" w:name="_GoBack"/>
             <w:r>
               <w:rPr>
                 <w:rFonts w:ascii="Cambria Math" w:eastAsia="Times New Roman" w:hAnsi="Cambria Math" w:cs="Cambria Math" w:hint="cs"/>
@@ -8479,7 +8407,6 @@
               </w:rPr>
               <w:t> </w:t>
             </w:r>
-            <w:bookmarkEnd w:id="9"/>
             <w:r>
               <w:rPr>
                 <w:rFonts w:ascii="Times New Roman" w:eastAsia="Times New Roman" w:hAnsi="Times New Roman" w:cs="David"/>
@@ -9366,7 +9293,7 @@
                 <w:lang w:eastAsia="he-IL"/>
               </w:rPr>
             </w:pPr>
-            <w:bookmarkStart w:id="10" w:name="ColumnTitle_9" w:colFirst="0" w:colLast="0"/>
+            <w:bookmarkStart w:id="9" w:name="ColumnTitle_9" w:colFirst="0" w:colLast="0"/>
             <w:r>
               <w:rPr>
                 <w:rFonts w:ascii="Times New Roman" w:eastAsia="Times New Roman" w:hAnsi="Times New Roman" w:cs="David" w:hint="cs"/>
@@ -9463,11 +9390,11 @@
                 <w:lang w:eastAsia="he-IL"/>
               </w:rPr>
             </w:pPr>
-            <w:bookmarkStart w:id="11" w:name="_Toc24954385"/>
-            <w:bookmarkStart w:id="12" w:name="_Toc24979420"/>
-            <w:bookmarkStart w:id="13" w:name="_Toc24979539"/>
-            <w:bookmarkStart w:id="14" w:name="_Toc24979628"/>
-            <w:bookmarkEnd w:id="10"/>
+            <w:bookmarkStart w:id="10" w:name="_Toc24954385"/>
+            <w:bookmarkStart w:id="11" w:name="_Toc24979420"/>
+            <w:bookmarkStart w:id="12" w:name="_Toc24979539"/>
+            <w:bookmarkStart w:id="13" w:name="_Toc24979628"/>
+            <w:bookmarkEnd w:id="9"/>
             <w:r>
               <w:rPr>
                 <w:rFonts w:ascii="Times New Roman" w:eastAsia="Times New Roman" w:hAnsi="Times New Roman" w:cs="David" w:hint="cs"/>
@@ -9478,10 +9405,10 @@
               </w:rPr>
               <w:t>השם</w:t>
             </w:r>
+            <w:bookmarkEnd w:id="10"/>
             <w:bookmarkEnd w:id="11"/>
             <w:bookmarkEnd w:id="12"/>
             <w:bookmarkEnd w:id="13"/>
-            <w:bookmarkEnd w:id="14"/>
           </w:p>
         </w:tc>
         <w:tc>
@@ -9566,11 +9493,11 @@
                 <w:lang w:eastAsia="he-IL"/>
               </w:rPr>
             </w:pPr>
-            <w:bookmarkStart w:id="15" w:name="_Toc24954386"/>
-            <w:bookmarkStart w:id="16" w:name="_Toc24979421"/>
-            <w:bookmarkStart w:id="17" w:name="_Toc24979540"/>
-            <w:bookmarkStart w:id="18" w:name="_Toc24979629"/>
-            <w:bookmarkStart w:id="19" w:name="_Toc24979693"/>
+            <w:bookmarkStart w:id="14" w:name="_Toc24954386"/>
+            <w:bookmarkStart w:id="15" w:name="_Toc24979421"/>
+            <w:bookmarkStart w:id="16" w:name="_Toc24979540"/>
+            <w:bookmarkStart w:id="17" w:name="_Toc24979629"/>
+            <w:bookmarkStart w:id="18" w:name="_Toc24979693"/>
             <w:r>
               <w:rPr>
                 <w:rFonts w:ascii="Times New Roman" w:eastAsia="Times New Roman" w:hAnsi="Times New Roman" w:cs="David" w:hint="cs"/>
@@ -9581,11 +9508,11 @@
               </w:rPr>
               <w:t>השם</w:t>
             </w:r>
+            <w:bookmarkEnd w:id="14"/>
             <w:bookmarkEnd w:id="15"/>
             <w:bookmarkEnd w:id="16"/>
             <w:bookmarkEnd w:id="17"/>
             <w:bookmarkEnd w:id="18"/>
-            <w:bookmarkEnd w:id="19"/>
           </w:p>
         </w:tc>
         <w:tc>
@@ -9656,7 +9583,7 @@
                 </w:ffData>
               </w:fldChar>
             </w:r>
-            <w:bookmarkStart w:id="20" w:name="טקסט21"/>
+            <w:bookmarkStart w:id="19" w:name="טקסט21"/>
             <w:r>
               <w:rPr>
                 <w:rFonts w:ascii="Times New Roman" w:eastAsia="Times New Roman" w:hAnsi="Times New Roman" w:cs="David"/>
@@ -9705,11 +9632,11 @@
               </w:rPr>
               <w:fldChar w:fldCharType="separate"/>
             </w:r>
-            <w:bookmarkStart w:id="21" w:name="_Toc24954387"/>
-            <w:bookmarkStart w:id="22" w:name="_Toc24979422"/>
-            <w:bookmarkStart w:id="23" w:name="_Toc24979541"/>
-            <w:bookmarkStart w:id="24" w:name="_Toc24979630"/>
-            <w:bookmarkStart w:id="25" w:name="_Toc24979694"/>
+            <w:bookmarkStart w:id="20" w:name="_Toc24979694"/>
+            <w:bookmarkStart w:id="21" w:name="_Toc24979630"/>
+            <w:bookmarkStart w:id="22" w:name="_Toc24979541"/>
+            <w:bookmarkStart w:id="23" w:name="_Toc24979422"/>
+            <w:bookmarkStart w:id="24" w:name="_Toc24954387"/>
             <w:r>
               <w:rPr>
                 <w:rFonts w:ascii="Times New Roman" w:eastAsia="Times New Roman" w:hAnsi="Times New Roman" w:cs="David"/>
@@ -9760,11 +9687,11 @@
               </w:rPr>
               <w:t> </w:t>
             </w:r>
+            <w:bookmarkEnd w:id="20"/>
             <w:bookmarkEnd w:id="21"/>
             <w:bookmarkEnd w:id="22"/>
             <w:bookmarkEnd w:id="23"/>
             <w:bookmarkEnd w:id="24"/>
-            <w:bookmarkEnd w:id="25"/>
             <w:r>
               <w:rPr>
                 <w:rFonts w:ascii="Times New Roman" w:eastAsia="Times New Roman" w:hAnsi="Times New Roman" w:cs="David"/>
@@ -9775,7 +9702,7 @@
               </w:rPr>
               <w:fldChar w:fldCharType="end"/>
             </w:r>
-            <w:bookmarkEnd w:id="20"/>
+            <w:bookmarkEnd w:id="19"/>
           </w:p>
         </w:tc>
         <w:tc>
@@ -9911,11 +9838,11 @@
               </w:rPr>
               <w:fldChar w:fldCharType="separate"/>
             </w:r>
-            <w:bookmarkStart w:id="26" w:name="_Toc24954388"/>
-            <w:bookmarkStart w:id="27" w:name="_Toc24979423"/>
-            <w:bookmarkStart w:id="28" w:name="_Toc24979542"/>
-            <w:bookmarkStart w:id="29" w:name="_Toc24979631"/>
-            <w:bookmarkStart w:id="30" w:name="_Toc24979695"/>
+            <w:bookmarkStart w:id="25" w:name="_Toc24979695"/>
+            <w:bookmarkStart w:id="26" w:name="_Toc24979631"/>
+            <w:bookmarkStart w:id="27" w:name="_Toc24979542"/>
+            <w:bookmarkStart w:id="28" w:name="_Toc24979423"/>
+            <w:bookmarkStart w:id="29" w:name="_Toc24954388"/>
             <w:r>
               <w:rPr>
                 <w:rFonts w:ascii="Times New Roman" w:eastAsia="Times New Roman" w:hAnsi="Times New Roman" w:cs="David"/>
@@ -9966,11 +9893,11 @@
               </w:rPr>
               <w:t> </w:t>
             </w:r>
+            <w:bookmarkEnd w:id="25"/>
             <w:bookmarkEnd w:id="26"/>
             <w:bookmarkEnd w:id="27"/>
             <w:bookmarkEnd w:id="28"/>
             <w:bookmarkEnd w:id="29"/>
-            <w:bookmarkEnd w:id="30"/>
             <w:r>
               <w:rPr>
                 <w:rFonts w:ascii="Times New Roman" w:eastAsia="Times New Roman" w:hAnsi="Times New Roman" w:cs="David"/>
@@ -10041,7 +9968,7 @@
                 </w:ffData>
               </w:fldChar>
             </w:r>
-            <w:bookmarkStart w:id="31" w:name="טקסט22"/>
+            <w:bookmarkStart w:id="30" w:name="טקסט22"/>
             <w:r>
               <w:rPr>
                 <w:rFonts w:ascii="Times New Roman" w:eastAsia="Times New Roman" w:hAnsi="Times New Roman" w:cs="David"/>
@@ -10090,11 +10017,11 @@
               </w:rPr>
               <w:fldChar w:fldCharType="separate"/>
             </w:r>
-            <w:bookmarkStart w:id="32" w:name="_Toc24954389"/>
-            <w:bookmarkStart w:id="33" w:name="_Toc24979424"/>
-            <w:bookmarkStart w:id="34" w:name="_Toc24979543"/>
-            <w:bookmarkStart w:id="35" w:name="_Toc24979632"/>
-            <w:bookmarkStart w:id="36" w:name="_Toc24979696"/>
+            <w:bookmarkStart w:id="31" w:name="_Toc24979696"/>
+            <w:bookmarkStart w:id="32" w:name="_Toc24979632"/>
+            <w:bookmarkStart w:id="33" w:name="_Toc24979543"/>
+            <w:bookmarkStart w:id="34" w:name="_Toc24979424"/>
+            <w:bookmarkStart w:id="35" w:name="_Toc24954389"/>
             <w:r>
               <w:rPr>
                 <w:rFonts w:ascii="Times New Roman" w:eastAsia="Times New Roman" w:hAnsi="Times New Roman" w:cs="David"/>
@@ -10145,11 +10072,11 @@
               </w:rPr>
               <w:t> </w:t>
             </w:r>
+            <w:bookmarkEnd w:id="31"/>
             <w:bookmarkEnd w:id="32"/>
             <w:bookmarkEnd w:id="33"/>
             <w:bookmarkEnd w:id="34"/>
             <w:bookmarkEnd w:id="35"/>
-            <w:bookmarkEnd w:id="36"/>
             <w:r>
               <w:rPr>
                 <w:rFonts w:ascii="Times New Roman" w:eastAsia="Times New Roman" w:hAnsi="Times New Roman" w:cs="David"/>
@@ -10160,7 +10087,7 @@
               </w:rPr>
               <w:fldChar w:fldCharType="end"/>
             </w:r>
-            <w:bookmarkEnd w:id="31"/>
+            <w:bookmarkEnd w:id="30"/>
           </w:p>
         </w:tc>
         <w:tc>
@@ -10295,11 +10222,11 @@
               </w:rPr>
               <w:fldChar w:fldCharType="separate"/>
             </w:r>
-            <w:bookmarkStart w:id="37" w:name="_Toc24954390"/>
-            <w:bookmarkStart w:id="38" w:name="_Toc24979425"/>
-            <w:bookmarkStart w:id="39" w:name="_Toc24979544"/>
-            <w:bookmarkStart w:id="40" w:name="_Toc24979633"/>
-            <w:bookmarkStart w:id="41" w:name="_Toc24979697"/>
+            <w:bookmarkStart w:id="36" w:name="_Toc24979697"/>
+            <w:bookmarkStart w:id="37" w:name="_Toc24979633"/>
+            <w:bookmarkStart w:id="38" w:name="_Toc24979544"/>
+            <w:bookmarkStart w:id="39" w:name="_Toc24979425"/>
+            <w:bookmarkStart w:id="40" w:name="_Toc24954390"/>
             <w:r>
               <w:rPr>
                 <w:rFonts w:ascii="Times New Roman" w:eastAsia="Times New Roman" w:hAnsi="Times New Roman" w:cs="David"/>
@@ -10350,11 +10277,11 @@
               </w:rPr>
               <w:t> </w:t>
             </w:r>
+            <w:bookmarkEnd w:id="36"/>
             <w:bookmarkEnd w:id="37"/>
             <w:bookmarkEnd w:id="38"/>
             <w:bookmarkEnd w:id="39"/>
             <w:bookmarkEnd w:id="40"/>
-            <w:bookmarkEnd w:id="41"/>
             <w:r>
               <w:rPr>
                 <w:rFonts w:ascii="Times New Roman" w:eastAsia="Times New Roman" w:hAnsi="Times New Roman" w:cs="David"/>
@@ -10387,7 +10314,7 @@
           </w:p>
         </w:tc>
       </w:tr>
-      <w:bookmarkStart w:id="42" w:name="טקסט23"/>
+      <w:bookmarkStart w:id="41" w:name="טקסט23"/>
       <w:tr>
         <w:trPr>
           <w:cantSplit/>
@@ -10474,11 +10401,11 @@
               </w:rPr>
               <w:fldChar w:fldCharType="separate"/>
             </w:r>
-            <w:bookmarkStart w:id="43" w:name="_Toc24954391"/>
-            <w:bookmarkStart w:id="44" w:name="_Toc24979426"/>
-            <w:bookmarkStart w:id="45" w:name="_Toc24979545"/>
-            <w:bookmarkStart w:id="46" w:name="_Toc24979634"/>
-            <w:bookmarkStart w:id="47" w:name="_Toc24979698"/>
+            <w:bookmarkStart w:id="42" w:name="_Toc24979698"/>
+            <w:bookmarkStart w:id="43" w:name="_Toc24979634"/>
+            <w:bookmarkStart w:id="44" w:name="_Toc24979545"/>
+            <w:bookmarkStart w:id="45" w:name="_Toc24979426"/>
+            <w:bookmarkStart w:id="46" w:name="_Toc24954391"/>
             <w:r>
               <w:rPr>
                 <w:rFonts w:ascii="Times New Roman" w:eastAsia="Times New Roman" w:hAnsi="Times New Roman" w:cs="David"/>
@@ -10529,11 +10456,11 @@
               </w:rPr>
               <w:t> </w:t>
             </w:r>
+            <w:bookmarkEnd w:id="42"/>
             <w:bookmarkEnd w:id="43"/>
             <w:bookmarkEnd w:id="44"/>
             <w:bookmarkEnd w:id="45"/>
             <w:bookmarkEnd w:id="46"/>
-            <w:bookmarkEnd w:id="47"/>
             <w:r>
               <w:rPr>
                 <w:rFonts w:ascii="Times New Roman" w:eastAsia="Times New Roman" w:hAnsi="Times New Roman" w:cs="David"/>
@@ -10678,11 +10605,11 @@
               </w:rPr>
               <w:fldChar w:fldCharType="separate"/>
             </w:r>
-            <w:bookmarkStart w:id="48" w:name="_Toc24954392"/>
-            <w:bookmarkStart w:id="49" w:name="_Toc24979427"/>
-            <w:bookmarkStart w:id="50" w:name="_Toc24979546"/>
-            <w:bookmarkStart w:id="51" w:name="_Toc24979635"/>
-            <w:bookmarkStart w:id="52" w:name="_Toc24979699"/>
+            <w:bookmarkStart w:id="47" w:name="_Toc24979699"/>
+            <w:bookmarkStart w:id="48" w:name="_Toc24979635"/>
+            <w:bookmarkStart w:id="49" w:name="_Toc24979546"/>
+            <w:bookmarkStart w:id="50" w:name="_Toc24979427"/>
+            <w:bookmarkStart w:id="51" w:name="_Toc24954392"/>
             <w:r>
               <w:rPr>
                 <w:rFonts w:ascii="Times New Roman" w:eastAsia="Times New Roman" w:hAnsi="Times New Roman" w:cs="David"/>
@@ -10733,11 +10660,11 @@
               </w:rPr>
               <w:t> </w:t>
             </w:r>
+            <w:bookmarkEnd w:id="47"/>
             <w:bookmarkEnd w:id="48"/>
             <w:bookmarkEnd w:id="49"/>
             <w:bookmarkEnd w:id="50"/>
             <w:bookmarkEnd w:id="51"/>
-            <w:bookmarkEnd w:id="52"/>
             <w:r>
               <w:rPr>
                 <w:rFonts w:ascii="Times New Roman" w:eastAsia="Times New Roman" w:hAnsi="Times New Roman" w:cs="David"/>
@@ -10857,11 +10784,11 @@
               </w:rPr>
               <w:fldChar w:fldCharType="separate"/>
             </w:r>
-            <w:bookmarkStart w:id="53" w:name="_Toc24954393"/>
-            <w:bookmarkStart w:id="54" w:name="_Toc24979428"/>
-            <w:bookmarkStart w:id="55" w:name="_Toc24979547"/>
-            <w:bookmarkStart w:id="56" w:name="_Toc24979636"/>
-            <w:bookmarkStart w:id="57" w:name="_Toc24979700"/>
+            <w:bookmarkStart w:id="52" w:name="_Toc24979700"/>
+            <w:bookmarkStart w:id="53" w:name="_Toc24979636"/>
+            <w:bookmarkStart w:id="54" w:name="_Toc24979547"/>
+            <w:bookmarkStart w:id="55" w:name="_Toc24979428"/>
+            <w:bookmarkStart w:id="56" w:name="_Toc24954393"/>
             <w:r>
               <w:rPr>
                 <w:rFonts w:ascii="Times New Roman" w:eastAsia="Times New Roman" w:hAnsi="Times New Roman" w:cs="David"/>
@@ -10912,11 +10839,11 @@
               </w:rPr>
               <w:t> </w:t>
             </w:r>
+            <w:bookmarkEnd w:id="52"/>
             <w:bookmarkEnd w:id="53"/>
             <w:bookmarkEnd w:id="54"/>
             <w:bookmarkEnd w:id="55"/>
             <w:bookmarkEnd w:id="56"/>
-            <w:bookmarkEnd w:id="57"/>
             <w:r>
               <w:rPr>
                 <w:rFonts w:ascii="Times New Roman" w:eastAsia="Times New Roman" w:hAnsi="Times New Roman" w:cs="David"/>
@@ -11062,11 +10989,11 @@
               </w:rPr>
               <w:fldChar w:fldCharType="separate"/>
             </w:r>
-            <w:bookmarkStart w:id="58" w:name="_Toc24954394"/>
-            <w:bookmarkStart w:id="59" w:name="_Toc24979429"/>
-            <w:bookmarkStart w:id="60" w:name="_Toc24979548"/>
-            <w:bookmarkStart w:id="61" w:name="_Toc24979637"/>
-            <w:bookmarkStart w:id="62" w:name="_Toc24979701"/>
+            <w:bookmarkStart w:id="57" w:name="_Toc24979701"/>
+            <w:bookmarkStart w:id="58" w:name="_Toc24979637"/>
+            <w:bookmarkStart w:id="59" w:name="_Toc24979548"/>
+            <w:bookmarkStart w:id="60" w:name="_Toc24979429"/>
+            <w:bookmarkStart w:id="61" w:name="_Toc24954394"/>
             <w:r>
               <w:rPr>
                 <w:rFonts w:ascii="Times New Roman" w:eastAsia="Times New Roman" w:hAnsi="Times New Roman" w:cs="David"/>
@@ -11117,11 +11044,11 @@
               </w:rPr>
               <w:t> </w:t>
             </w:r>
+            <w:bookmarkEnd w:id="57"/>
             <w:bookmarkEnd w:id="58"/>
             <w:bookmarkEnd w:id="59"/>
             <w:bookmarkEnd w:id="60"/>
             <w:bookmarkEnd w:id="61"/>
-            <w:bookmarkEnd w:id="62"/>
             <w:r>
               <w:rPr>
                 <w:rFonts w:ascii="Times New Roman" w:eastAsia="Times New Roman" w:hAnsi="Times New Roman" w:cs="David"/>
@@ -11154,7 +11081,7 @@
           </w:p>
         </w:tc>
       </w:tr>
-      <w:bookmarkEnd w:id="42"/>
+      <w:bookmarkEnd w:id="41"/>
     </w:tbl>
     <w:p>
       <w:pPr>
@@ -11261,16 +11188,16 @@
     </w:p>
     <w:p>
       <w:pPr>
-        <w:pStyle w:val="2"/>
+        <w:pStyle w:val="Heading2"/>
         <w:rPr>
           <w:rtl/>
         </w:rPr>
       </w:pPr>
-      <w:bookmarkStart w:id="63" w:name="_Toc24954395"/>
-      <w:bookmarkStart w:id="64" w:name="_Toc24979430"/>
-      <w:bookmarkStart w:id="65" w:name="_Toc24979549"/>
-      <w:bookmarkStart w:id="66" w:name="_Toc24979638"/>
-      <w:bookmarkStart w:id="67" w:name="_Toc24979702"/>
+      <w:bookmarkStart w:id="62" w:name="_Toc24954395"/>
+      <w:bookmarkStart w:id="63" w:name="_Toc24979430"/>
+      <w:bookmarkStart w:id="64" w:name="_Toc24979549"/>
+      <w:bookmarkStart w:id="65" w:name="_Toc24979638"/>
+      <w:bookmarkStart w:id="66" w:name="_Toc24979702"/>
       <w:r>
         <w:rPr>
           <w:rFonts w:hint="cs"/>
@@ -11286,11 +11213,11 @@
         </w:rPr>
         <w:t>- נספח א' פרטי המוכרים</w:t>
       </w:r>
+      <w:bookmarkEnd w:id="62"/>
       <w:bookmarkEnd w:id="63"/>
       <w:bookmarkEnd w:id="64"/>
       <w:bookmarkEnd w:id="65"/>
       <w:bookmarkEnd w:id="66"/>
-      <w:bookmarkEnd w:id="67"/>
     </w:p>
     <w:p>
       <w:pPr>
@@ -11350,7 +11277,7 @@
                 <w:lang w:eastAsia="he-IL"/>
               </w:rPr>
             </w:pPr>
-            <w:bookmarkStart w:id="68" w:name="ColumnTitle_10"/>
+            <w:bookmarkStart w:id="67" w:name="ColumnTitle_10"/>
             <w:r>
               <w:rPr>
                 <w:rFonts w:ascii="David" w:hAnsi="David" w:cs="David"/>
@@ -11865,7 +11792,7 @@
           </w:p>
         </w:tc>
       </w:tr>
-      <w:bookmarkEnd w:id="68"/>
+      <w:bookmarkEnd w:id="67"/>
     </w:tbl>
     <w:p>
       <w:pPr>
@@ -11926,7 +11853,7 @@
                 <w:lang w:eastAsia="he-IL"/>
               </w:rPr>
             </w:pPr>
-            <w:bookmarkStart w:id="69" w:name="ColumnTitle_11"/>
+            <w:bookmarkStart w:id="68" w:name="ColumnTitle_11"/>
             <w:r>
               <w:rPr>
                 <w:rFonts w:ascii="David" w:hAnsi="David" w:cs="David" w:hint="cs"/>
@@ -12034,7 +11961,7 @@
           </w:p>
         </w:tc>
       </w:tr>
-      <w:bookmarkEnd w:id="69"/>
+      <w:bookmarkEnd w:id="68"/>
       <w:tr>
         <w:trPr>
           <w:cantSplit/>
@@ -22365,17 +22292,17 @@
     </w:p>
     <w:p>
       <w:pPr>
-        <w:pStyle w:val="2"/>
+        <w:pStyle w:val="Heading2"/>
         <w:ind w:left="0"/>
         <w:rPr>
           <w:rtl/>
         </w:rPr>
       </w:pPr>
-      <w:bookmarkStart w:id="70" w:name="_Toc24954396"/>
-      <w:bookmarkStart w:id="71" w:name="_Toc24979431"/>
-      <w:bookmarkStart w:id="72" w:name="_Toc24979550"/>
-      <w:bookmarkStart w:id="73" w:name="_Toc24979639"/>
-      <w:bookmarkStart w:id="74" w:name="_Toc24979703"/>
+      <w:bookmarkStart w:id="69" w:name="_Toc24954396"/>
+      <w:bookmarkStart w:id="70" w:name="_Toc24979431"/>
+      <w:bookmarkStart w:id="71" w:name="_Toc24979550"/>
+      <w:bookmarkStart w:id="72" w:name="_Toc24979639"/>
+      <w:bookmarkStart w:id="73" w:name="_Toc24979703"/>
       <w:r>
         <w:rPr>
           <w:rFonts w:hint="cs"/>
@@ -22391,11 +22318,11 @@
         </w:rPr>
         <w:t>- נספח ב' פרטי הקונים</w:t>
       </w:r>
+      <w:bookmarkEnd w:id="69"/>
       <w:bookmarkEnd w:id="70"/>
       <w:bookmarkEnd w:id="71"/>
       <w:bookmarkEnd w:id="72"/>
       <w:bookmarkEnd w:id="73"/>
-      <w:bookmarkEnd w:id="74"/>
     </w:p>
     <w:p>
       <w:pPr>
@@ -22455,7 +22382,7 @@
                 <w:lang w:eastAsia="he-IL"/>
               </w:rPr>
             </w:pPr>
-            <w:bookmarkStart w:id="75" w:name="ColumnTitle_12"/>
+            <w:bookmarkStart w:id="74" w:name="ColumnTitle_12"/>
             <w:r>
               <w:rPr>
                 <w:rFonts w:ascii="David" w:hAnsi="David" w:cs="David"/>
@@ -22970,7 +22897,7 @@
           </w:p>
         </w:tc>
       </w:tr>
-      <w:bookmarkEnd w:id="75"/>
+      <w:bookmarkEnd w:id="74"/>
     </w:tbl>
     <w:p>
       <w:pPr>
@@ -35852,17 +35779,17 @@
     </w:p>
     <w:p>
       <w:pPr>
-        <w:pStyle w:val="2"/>
+        <w:pStyle w:val="Heading2"/>
         <w:ind w:left="0"/>
         <w:rPr>
           <w:rtl/>
         </w:rPr>
       </w:pPr>
-      <w:bookmarkStart w:id="76" w:name="_Toc24954397"/>
-      <w:bookmarkStart w:id="77" w:name="_Toc24979432"/>
-      <w:bookmarkStart w:id="78" w:name="_Toc24979551"/>
-      <w:bookmarkStart w:id="79" w:name="_Toc24979640"/>
-      <w:bookmarkStart w:id="80" w:name="_Toc24979704"/>
+      <w:bookmarkStart w:id="75" w:name="_Toc24954397"/>
+      <w:bookmarkStart w:id="76" w:name="_Toc24979432"/>
+      <w:bookmarkStart w:id="77" w:name="_Toc24979551"/>
+      <w:bookmarkStart w:id="78" w:name="_Toc24979640"/>
+      <w:bookmarkStart w:id="79" w:name="_Toc24979704"/>
       <w:r>
         <w:rPr>
           <w:rFonts w:hint="cs"/>
@@ -35871,15 +35798,15 @@
         <w:lastRenderedPageBreak/>
         <w:t>אימות חתימות הצדדים לעסקה</w:t>
       </w:r>
+      <w:bookmarkEnd w:id="75"/>
       <w:bookmarkEnd w:id="76"/>
       <w:bookmarkEnd w:id="77"/>
       <w:bookmarkEnd w:id="78"/>
       <w:bookmarkEnd w:id="79"/>
-      <w:bookmarkEnd w:id="80"/>
     </w:p>
     <w:p>
       <w:pPr>
-        <w:pStyle w:val="3"/>
+        <w:pStyle w:val="Heading3"/>
         <w:rPr>
           <w:rtl/>
         </w:rPr>
@@ -35890,11 +35817,11 @@
         </w:rPr>
         <w:br/>
       </w:r>
-      <w:bookmarkStart w:id="81" w:name="_Toc24954398"/>
-      <w:bookmarkStart w:id="82" w:name="_Toc24979433"/>
-      <w:bookmarkStart w:id="83" w:name="_Toc24979552"/>
-      <w:bookmarkStart w:id="84" w:name="_Toc24979641"/>
-      <w:bookmarkStart w:id="85" w:name="_Toc24979705"/>
+      <w:bookmarkStart w:id="80" w:name="_Toc24954398"/>
+      <w:bookmarkStart w:id="81" w:name="_Toc24979433"/>
+      <w:bookmarkStart w:id="82" w:name="_Toc24979552"/>
+      <w:bookmarkStart w:id="83" w:name="_Toc24979641"/>
+      <w:bookmarkStart w:id="84" w:name="_Toc24979705"/>
       <w:r>
         <w:rPr>
           <w:rFonts w:hint="cs"/>
@@ -35909,11 +35836,11 @@
         </w:rPr>
         <w:t xml:space="preserve"> או רשם</w:t>
       </w:r>
+      <w:bookmarkEnd w:id="80"/>
       <w:bookmarkEnd w:id="81"/>
       <w:bookmarkEnd w:id="82"/>
       <w:bookmarkEnd w:id="83"/>
       <w:bookmarkEnd w:id="84"/>
-      <w:bookmarkEnd w:id="85"/>
     </w:p>
     <w:p>
       <w:pPr>
@@ -36462,43 +36389,34 @@
             </w:r>
             <w:r>
               <w:rPr>
-                <w:rFonts w:ascii="Times New Roman" w:eastAsia="Times New Roman" w:hAnsi="Times New Roman" w:cs="Times New Roman"/>
-                <w:rtl/>
-                <w:lang w:eastAsia="he-IL"/>
-              </w:rPr>
-              <w:t> </w:t>
-            </w:r>
-            <w:r>
-              <w:rPr>
-                <w:rFonts w:ascii="Times New Roman" w:eastAsia="Times New Roman" w:hAnsi="Times New Roman" w:cs="Times New Roman"/>
-                <w:rtl/>
-                <w:lang w:eastAsia="he-IL"/>
-              </w:rPr>
-              <w:t> </w:t>
-            </w:r>
-            <w:r>
-              <w:rPr>
-                <w:rFonts w:ascii="Times New Roman" w:eastAsia="Times New Roman" w:hAnsi="Times New Roman" w:cs="Times New Roman"/>
-                <w:rtl/>
-                <w:lang w:eastAsia="he-IL"/>
-              </w:rPr>
-              <w:t> </w:t>
-            </w:r>
-            <w:r>
-              <w:rPr>
-                <w:rFonts w:ascii="Times New Roman" w:eastAsia="Times New Roman" w:hAnsi="Times New Roman" w:cs="Times New Roman"/>
-                <w:rtl/>
-                <w:lang w:eastAsia="he-IL"/>
-              </w:rPr>
-              <w:t> </w:t>
-            </w:r>
-            <w:r>
-              <w:rPr>
-                <w:rFonts w:ascii="Times New Roman" w:eastAsia="Times New Roman" w:hAnsi="Times New Roman" w:cs="Times New Roman"/>
-                <w:rtl/>
-                <w:lang w:eastAsia="he-IL"/>
-              </w:rPr>
-              <w:t> </w:t>
+                <w:rFonts w:ascii="Times New Roman" w:eastAsia="Times New Roman" w:hAnsi="Times New Roman" w:cs="Times New Roman" w:hint="cs"/>
+                <w:rtl/>
+                <w:lang w:eastAsia="he-IL"/>
+              </w:rPr>
+              <w:t>עו"</w:t>
+            </w:r>
+            <w:r>
+              <w:rPr>
+                <w:rFonts w:ascii="Times New Roman" w:eastAsia="Times New Roman" w:hAnsi="Times New Roman" w:cs="David" w:hint="cs"/>
+                <w:rtl/>
+                <w:lang w:eastAsia="he-IL"/>
+              </w:rPr>
+              <w:t>ד ג</w:t>
+            </w:r>
+            <w:r>
+              <w:rPr>
+                <w:rFonts w:ascii="Times New Roman" w:eastAsia="Times New Roman" w:hAnsi="Times New Roman" w:cs="David"/>
+                <w:lang w:eastAsia="he-IL"/>
+              </w:rPr>
+              <w:t>'</w:t>
+            </w:r>
+            <w:r>
+              <w:rPr>
+                <w:rFonts w:ascii="Times New Roman" w:eastAsia="Times New Roman" w:hAnsi="Times New Roman" w:cs="David" w:hint="cs"/>
+                <w:rtl/>
+                <w:lang w:eastAsia="he-IL"/>
+              </w:rPr>
+              <w:t>ודי אמיר מ.ר 61379 ת.ד 447 ,שדרות</w:t>
             </w:r>
             <w:r>
               <w:rPr>
@@ -36773,16 +36691,16 @@
     </w:p>
     <w:p>
       <w:pPr>
-        <w:pStyle w:val="3"/>
+        <w:pStyle w:val="Heading3"/>
         <w:rPr>
           <w:rtl/>
         </w:rPr>
       </w:pPr>
-      <w:bookmarkStart w:id="86" w:name="_Toc24954399"/>
-      <w:bookmarkStart w:id="87" w:name="_Toc24979434"/>
-      <w:bookmarkStart w:id="88" w:name="_Toc24979553"/>
-      <w:bookmarkStart w:id="89" w:name="_Toc24979642"/>
-      <w:bookmarkStart w:id="90" w:name="_Toc24979706"/>
+      <w:bookmarkStart w:id="85" w:name="_Toc24954399"/>
+      <w:bookmarkStart w:id="86" w:name="_Toc24979434"/>
+      <w:bookmarkStart w:id="87" w:name="_Toc24979553"/>
+      <w:bookmarkStart w:id="88" w:name="_Toc24979642"/>
+      <w:bookmarkStart w:id="89" w:name="_Toc24979706"/>
       <w:r>
         <w:rPr>
           <w:rFonts w:hint="cs"/>
@@ -36790,11 +36708,11 @@
         </w:rPr>
         <w:t>אימות חתימה ע"י עו"ד</w:t>
       </w:r>
+      <w:bookmarkEnd w:id="85"/>
       <w:bookmarkEnd w:id="86"/>
       <w:bookmarkEnd w:id="87"/>
       <w:bookmarkEnd w:id="88"/>
       <w:bookmarkEnd w:id="89"/>
-      <w:bookmarkEnd w:id="90"/>
     </w:p>
     <w:p>
       <w:pPr>
@@ -37238,43 +37156,19 @@
             </w:r>
             <w:r>
               <w:rPr>
-                <w:rFonts w:ascii="Times New Roman" w:eastAsia="Times New Roman" w:hAnsi="Times New Roman" w:cs="Times New Roman"/>
-                <w:rtl/>
-                <w:lang w:eastAsia="he-IL"/>
-              </w:rPr>
-              <w:t> </w:t>
-            </w:r>
-            <w:r>
-              <w:rPr>
-                <w:rFonts w:ascii="Times New Roman" w:eastAsia="Times New Roman" w:hAnsi="Times New Roman" w:cs="Times New Roman"/>
-                <w:rtl/>
-                <w:lang w:eastAsia="he-IL"/>
-              </w:rPr>
-              <w:t> </w:t>
-            </w:r>
-            <w:r>
-              <w:rPr>
-                <w:rFonts w:ascii="Times New Roman" w:eastAsia="Times New Roman" w:hAnsi="Times New Roman" w:cs="Times New Roman"/>
-                <w:rtl/>
-                <w:lang w:eastAsia="he-IL"/>
-              </w:rPr>
-              <w:t> </w:t>
-            </w:r>
-            <w:r>
-              <w:rPr>
-                <w:rFonts w:ascii="Times New Roman" w:eastAsia="Times New Roman" w:hAnsi="Times New Roman" w:cs="Times New Roman"/>
-                <w:rtl/>
-                <w:lang w:eastAsia="he-IL"/>
-              </w:rPr>
-              <w:t> </w:t>
-            </w:r>
-            <w:r>
-              <w:rPr>
-                <w:rFonts w:ascii="Times New Roman" w:eastAsia="Times New Roman" w:hAnsi="Times New Roman" w:cs="Times New Roman"/>
-                <w:rtl/>
-                <w:lang w:eastAsia="he-IL"/>
-              </w:rPr>
-              <w:t> </w:t>
+                <w:rFonts w:ascii="Times New Roman" w:eastAsia="Times New Roman" w:hAnsi="Times New Roman" w:cs="Times New Roman" w:hint="cs"/>
+                <w:rtl/>
+                <w:lang w:eastAsia="he-IL"/>
+              </w:rPr>
+              <w:t>ע</w:t>
+            </w:r>
+            <w:r>
+              <w:rPr>
+                <w:rFonts w:ascii="Times New Roman" w:eastAsia="Times New Roman" w:hAnsi="Times New Roman" w:cs="David" w:hint="cs"/>
+                <w:rtl/>
+                <w:lang w:eastAsia="he-IL"/>
+              </w:rPr>
+              <w:t xml:space="preserve">ו"ד מינה ביליה מ.ר 62850 יצחק בן צבי 10 , באר-שבע </w:t>
             </w:r>
             <w:r>
               <w:rPr>
@@ -37550,16 +37444,16 @@
     </w:p>
     <w:p>
       <w:pPr>
-        <w:pStyle w:val="3"/>
+        <w:pStyle w:val="Heading3"/>
         <w:rPr>
           <w:rtl/>
         </w:rPr>
       </w:pPr>
-      <w:bookmarkStart w:id="91" w:name="_Toc24954400"/>
-      <w:bookmarkStart w:id="92" w:name="_Toc24979435"/>
-      <w:bookmarkStart w:id="93" w:name="_Toc24979554"/>
-      <w:bookmarkStart w:id="94" w:name="_Toc24979643"/>
-      <w:bookmarkStart w:id="95" w:name="_Toc24979707"/>
+      <w:bookmarkStart w:id="90" w:name="_Toc24954400"/>
+      <w:bookmarkStart w:id="91" w:name="_Toc24979435"/>
+      <w:bookmarkStart w:id="92" w:name="_Toc24979554"/>
+      <w:bookmarkStart w:id="93" w:name="_Toc24979643"/>
+      <w:bookmarkStart w:id="94" w:name="_Toc24979707"/>
       <w:r>
         <w:rPr>
           <w:rFonts w:hint="cs"/>
@@ -37567,11 +37461,11 @@
         </w:rPr>
         <w:t>אימות חתימה ע"י עו"ד</w:t>
       </w:r>
+      <w:bookmarkEnd w:id="90"/>
       <w:bookmarkEnd w:id="91"/>
       <w:bookmarkEnd w:id="92"/>
       <w:bookmarkEnd w:id="93"/>
       <w:bookmarkEnd w:id="94"/>
-      <w:bookmarkEnd w:id="95"/>
     </w:p>
     <w:p>
       <w:pPr>
@@ -37914,43 +37808,11 @@
             </w:r>
             <w:r>
               <w:rPr>
-                <w:rFonts w:ascii="Times New Roman" w:eastAsia="Times New Roman" w:hAnsi="Times New Roman" w:cs="Times New Roman"/>
-                <w:rtl/>
-                <w:lang w:eastAsia="he-IL"/>
-              </w:rPr>
-              <w:t> </w:t>
-            </w:r>
-            <w:r>
-              <w:rPr>
-                <w:rFonts w:ascii="Times New Roman" w:eastAsia="Times New Roman" w:hAnsi="Times New Roman" w:cs="Times New Roman"/>
-                <w:rtl/>
-                <w:lang w:eastAsia="he-IL"/>
-              </w:rPr>
-              <w:t> </w:t>
-            </w:r>
-            <w:r>
-              <w:rPr>
-                <w:rFonts w:ascii="Times New Roman" w:eastAsia="Times New Roman" w:hAnsi="Times New Roman" w:cs="Times New Roman"/>
-                <w:rtl/>
-                <w:lang w:eastAsia="he-IL"/>
-              </w:rPr>
-              <w:t> </w:t>
-            </w:r>
-            <w:r>
-              <w:rPr>
-                <w:rFonts w:ascii="Times New Roman" w:eastAsia="Times New Roman" w:hAnsi="Times New Roman" w:cs="Times New Roman"/>
-                <w:rtl/>
-                <w:lang w:eastAsia="he-IL"/>
-              </w:rPr>
-              <w:t> </w:t>
-            </w:r>
-            <w:r>
-              <w:rPr>
-                <w:rFonts w:ascii="Times New Roman" w:eastAsia="Times New Roman" w:hAnsi="Times New Roman" w:cs="Times New Roman"/>
-                <w:rtl/>
-                <w:lang w:eastAsia="he-IL"/>
-              </w:rPr>
-              <w:t> </w:t>
+                <w:rFonts w:ascii="Times New Roman" w:eastAsia="Times New Roman" w:hAnsi="Times New Roman" w:cs="Times New Roman" w:hint="cs"/>
+                <w:rtl/>
+                <w:lang w:eastAsia="he-IL"/>
+              </w:rPr>
+              <w:t>מ</w:t>
             </w:r>
             <w:r>
               <w:rPr>
@@ -38052,43 +37914,34 @@
             </w:r>
             <w:r>
               <w:rPr>
-                <w:rFonts w:ascii="Times New Roman" w:eastAsia="Times New Roman" w:hAnsi="Times New Roman" w:cs="Times New Roman"/>
-                <w:rtl/>
-                <w:lang w:eastAsia="he-IL"/>
-              </w:rPr>
-              <w:t> </w:t>
-            </w:r>
-            <w:r>
-              <w:rPr>
-                <w:rFonts w:ascii="Times New Roman" w:eastAsia="Times New Roman" w:hAnsi="Times New Roman" w:cs="Times New Roman"/>
-                <w:rtl/>
-                <w:lang w:eastAsia="he-IL"/>
-              </w:rPr>
-              <w:t> </w:t>
-            </w:r>
-            <w:r>
-              <w:rPr>
-                <w:rFonts w:ascii="Times New Roman" w:eastAsia="Times New Roman" w:hAnsi="Times New Roman" w:cs="Times New Roman"/>
-                <w:rtl/>
-                <w:lang w:eastAsia="he-IL"/>
-              </w:rPr>
-              <w:t> </w:t>
-            </w:r>
-            <w:r>
-              <w:rPr>
-                <w:rFonts w:ascii="Times New Roman" w:eastAsia="Times New Roman" w:hAnsi="Times New Roman" w:cs="Times New Roman"/>
-                <w:rtl/>
-                <w:lang w:eastAsia="he-IL"/>
-              </w:rPr>
-              <w:t> </w:t>
-            </w:r>
-            <w:r>
-              <w:rPr>
-                <w:rFonts w:ascii="Times New Roman" w:eastAsia="Times New Roman" w:hAnsi="Times New Roman" w:cs="Times New Roman"/>
-                <w:rtl/>
-                <w:lang w:eastAsia="he-IL"/>
-              </w:rPr>
-              <w:t> </w:t>
+                <w:rFonts w:ascii="Times New Roman" w:eastAsia="Times New Roman" w:hAnsi="Times New Roman" w:cs="Times New Roman" w:hint="cs"/>
+                <w:rtl/>
+                <w:lang w:eastAsia="he-IL"/>
+              </w:rPr>
+              <w:t>ע</w:t>
+            </w:r>
+            <w:r>
+              <w:rPr>
+                <w:rFonts w:ascii="Times New Roman" w:eastAsia="Times New Roman" w:hAnsi="Times New Roman" w:cs="David" w:hint="cs"/>
+                <w:rtl/>
+                <w:lang w:eastAsia="he-IL"/>
+              </w:rPr>
+              <w:t>ו"ד ג</w:t>
+            </w:r>
+            <w:r>
+              <w:rPr>
+                <w:rFonts w:ascii="Times New Roman" w:eastAsia="Times New Roman" w:hAnsi="Times New Roman" w:cs="David"/>
+                <w:lang w:eastAsia="he-IL"/>
+              </w:rPr>
+              <w:t>'</w:t>
+            </w:r>
+            <w:r>
+              <w:rPr>
+                <w:rFonts w:ascii="Times New Roman" w:eastAsia="Times New Roman" w:hAnsi="Times New Roman" w:cs="David" w:hint="cs"/>
+                <w:rtl/>
+                <w:lang w:eastAsia="he-IL"/>
+              </w:rPr>
+              <w:t xml:space="preserve">ודי אמיר מ.ר 61379 ת.ד 447 ,שדרות </w:t>
             </w:r>
             <w:r>
               <w:rPr>
@@ -38358,11 +38211,11 @@
           <w:rtl/>
         </w:rPr>
       </w:pPr>
-      <w:bookmarkStart w:id="96" w:name="_Toc24954401"/>
-      <w:bookmarkStart w:id="97" w:name="_Toc24979436"/>
-      <w:bookmarkStart w:id="98" w:name="_Toc24979555"/>
-      <w:bookmarkStart w:id="99" w:name="_Toc24979644"/>
-      <w:bookmarkStart w:id="100" w:name="_Toc24979708"/>
+      <w:bookmarkStart w:id="95" w:name="_Toc24954401"/>
+      <w:bookmarkStart w:id="96" w:name="_Toc24979436"/>
+      <w:bookmarkStart w:id="97" w:name="_Toc24979555"/>
+      <w:bookmarkStart w:id="98" w:name="_Toc24979644"/>
+      <w:bookmarkStart w:id="99" w:name="_Toc24979708"/>
       <w:r>
         <w:rPr>
           <w:rFonts w:hint="cs"/>
@@ -38381,11 +38234,11 @@
         </w:rPr>
         <w:t xml:space="preserve"> (נדרש כשאין אישור של עו"ד המאמת)</w:t>
       </w:r>
+      <w:bookmarkEnd w:id="95"/>
       <w:bookmarkEnd w:id="96"/>
       <w:bookmarkEnd w:id="97"/>
       <w:bookmarkEnd w:id="98"/>
       <w:bookmarkEnd w:id="99"/>
-      <w:bookmarkEnd w:id="100"/>
     </w:p>
     <w:p>
       <w:pPr>
@@ -38795,43 +38648,26 @@
             </w:r>
             <w:r>
               <w:rPr>
-                <w:rFonts w:ascii="Times New Roman" w:eastAsia="Times New Roman" w:hAnsi="Times New Roman" w:cs="Times New Roman"/>
-                <w:rtl/>
-                <w:lang w:eastAsia="he-IL"/>
-              </w:rPr>
-              <w:t> </w:t>
-            </w:r>
-            <w:r>
-              <w:rPr>
-                <w:rFonts w:ascii="Times New Roman" w:eastAsia="Times New Roman" w:hAnsi="Times New Roman" w:cs="Times New Roman"/>
-                <w:rtl/>
-                <w:lang w:eastAsia="he-IL"/>
-              </w:rPr>
-              <w:t> </w:t>
-            </w:r>
-            <w:r>
-              <w:rPr>
-                <w:rFonts w:ascii="Times New Roman" w:eastAsia="Times New Roman" w:hAnsi="Times New Roman" w:cs="Times New Roman"/>
-                <w:rtl/>
-                <w:lang w:eastAsia="he-IL"/>
-              </w:rPr>
-              <w:t> </w:t>
-            </w:r>
-            <w:r>
-              <w:rPr>
-                <w:rFonts w:ascii="Times New Roman" w:eastAsia="Times New Roman" w:hAnsi="Times New Roman" w:cs="Times New Roman"/>
-                <w:rtl/>
-                <w:lang w:eastAsia="he-IL"/>
-              </w:rPr>
-              <w:t> </w:t>
-            </w:r>
-            <w:r>
-              <w:rPr>
-                <w:rFonts w:ascii="Times New Roman" w:eastAsia="Times New Roman" w:hAnsi="Times New Roman" w:cs="Times New Roman"/>
-                <w:rtl/>
-                <w:lang w:eastAsia="he-IL"/>
-              </w:rPr>
-              <w:t> </w:t>
+                <w:rFonts w:ascii="Times New Roman" w:eastAsia="Times New Roman" w:hAnsi="Times New Roman" w:cs="David" w:hint="cs"/>
+                <w:rtl/>
+                <w:lang w:eastAsia="he-IL"/>
+              </w:rPr>
+              <w:t>עו"ד ג</w:t>
+            </w:r>
+            <w:r>
+              <w:rPr>
+                <w:rFonts w:ascii="Times New Roman" w:eastAsia="Times New Roman" w:hAnsi="Times New Roman" w:cs="David"/>
+                <w:lang w:eastAsia="he-IL"/>
+              </w:rPr>
+              <w:t>'</w:t>
+            </w:r>
+            <w:r>
+              <w:rPr>
+                <w:rFonts w:ascii="Times New Roman" w:eastAsia="Times New Roman" w:hAnsi="Times New Roman" w:cs="David" w:hint="cs"/>
+                <w:rtl/>
+                <w:lang w:eastAsia="he-IL"/>
+              </w:rPr>
+              <w:t xml:space="preserve">ודי אמיר מ.ר 61379 ת.ד 447 , שדרות </w:t>
             </w:r>
             <w:r>
               <w:rPr>
@@ -39099,9 +38935,9 @@
           <w:rtl/>
         </w:rPr>
       </w:pPr>
-      <w:bookmarkStart w:id="101" w:name="_Toc24979556"/>
-      <w:bookmarkStart w:id="102" w:name="_Toc24979645"/>
-      <w:bookmarkStart w:id="103" w:name="_Toc24979709"/>
+      <w:bookmarkStart w:id="100" w:name="_Toc24979556"/>
+      <w:bookmarkStart w:id="101" w:name="_Toc24979645"/>
+      <w:bookmarkStart w:id="102" w:name="_Toc24979709"/>
       <w:r>
         <w:rPr>
           <w:rFonts w:ascii="Calibri" w:eastAsia="Calibri" w:hAnsi="Calibri" w:cs="David" w:hint="cs"/>
@@ -39122,9 +38958,9 @@
         </w:rPr>
         <w:t>(ניהול ורישום) התשע"ב-2011</w:t>
       </w:r>
+      <w:bookmarkEnd w:id="100"/>
       <w:bookmarkEnd w:id="101"/>
       <w:bookmarkEnd w:id="102"/>
-      <w:bookmarkEnd w:id="103"/>
     </w:p>
     <w:p>
       <w:pPr>
@@ -40719,7 +40555,7 @@
       </w:r>
       <w:r>
         <w:rPr>
-          <w:rStyle w:val="a8"/>
+          <w:rStyle w:val="FootnoteReference"/>
           <w:rFonts w:ascii="Times New Roman" w:eastAsia="Times New Roman" w:hAnsi="Times New Roman" w:cs="David" w:hint="cs"/>
           <w:rtl/>
           <w:lang w:eastAsia="he-IL"/>
@@ -41384,7 +41220,7 @@
 </file>
 
 <file path=word/endnotes.xml><?xml version="1.0" encoding="utf-8"?>
-<w:endnotes xmlns:wpc="http://schemas.microsoft.com/office/word/2010/wordprocessingCanvas" xmlns:cx="http://schemas.microsoft.com/office/drawing/2014/chartex" xmlns:cx1="http://schemas.microsoft.com/office/drawing/2015/9/8/chartex" xmlns:mc="http://schemas.openxmlformats.org/markup-compatibility/2006" xmlns:o="urn:schemas-microsoft-com:office:office" xmlns:r="http://schemas.openxmlformats.org/officeDocument/2006/relationships" xmlns:m="http://schemas.openxmlformats.org/officeDocument/2006/math" xmlns:v="urn:schemas-microsoft-com:vml" xmlns:wp14="http://schemas.microsoft.com/office/word/2010/wordprocessingDrawing" xmlns:wp="http://schemas.openxmlformats.org/drawingml/2006/wordprocessingDrawing" xmlns:w10="urn:schemas-microsoft-com:office:word" xmlns:w="http://schemas.openxmlformats.org/wordprocessingml/2006/main" xmlns:w14="http://schemas.microsoft.com/office/word/2010/wordml" xmlns:w15="http://schemas.microsoft.com/office/word/2012/wordml" xmlns:w16se="http://schemas.microsoft.com/office/word/2015/wordml/symex" xmlns:wpg="http://schemas.microsoft.com/office/word/2010/wordprocessingGroup" xmlns:wpi="http://schemas.microsoft.com/office/word/2010/wordprocessingInk" xmlns:wne="http://schemas.microsoft.com/office/word/2006/wordml" xmlns:wps="http://schemas.microsoft.com/office/word/2010/wordprocessingShape" mc:Ignorable="w14 w15 w16se wp14">
+<w:endnotes xmlns:wpc="http://schemas.microsoft.com/office/word/2010/wordprocessingCanvas" xmlns:cx="http://schemas.microsoft.com/office/drawing/2014/chartex" xmlns:cx1="http://schemas.microsoft.com/office/drawing/2015/9/8/chartex" xmlns:cx2="http://schemas.microsoft.com/office/drawing/2015/10/21/chartex" xmlns:cx3="http://schemas.microsoft.com/office/drawing/2016/5/9/chartex" xmlns:cx4="http://schemas.microsoft.com/office/drawing/2016/5/10/chartex" xmlns:cx5="http://schemas.microsoft.com/office/drawing/2016/5/11/chartex" xmlns:cx6="http://schemas.microsoft.com/office/drawing/2016/5/12/chartex" xmlns:cx7="http://schemas.microsoft.com/office/drawing/2016/5/13/chartex" xmlns:cx8="http://schemas.microsoft.com/office/drawing/2016/5/14/chartex" xmlns:mc="http://schemas.openxmlformats.org/markup-compatibility/2006" xmlns:aink="http://schemas.microsoft.com/office/drawing/2016/ink" xmlns:am3d="http://schemas.microsoft.com/office/drawing/2017/model3d" xmlns:o="urn:schemas-microsoft-com:office:office" xmlns:oel="http://schemas.microsoft.com/office/2019/extlst" xmlns:r="http://schemas.openxmlformats.org/officeDocument/2006/relationships" xmlns:m="http://schemas.openxmlformats.org/officeDocument/2006/math" xmlns:v="urn:schemas-microsoft-com:vml" xmlns:wp14="http://schemas.microsoft.com/office/word/2010/wordprocessingDrawing" xmlns:wp="http://schemas.openxmlformats.org/drawingml/2006/wordprocessingDrawing" xmlns:w10="urn:schemas-microsoft-com:office:word" xmlns:w="http://schemas.openxmlformats.org/wordprocessingml/2006/main" xmlns:w14="http://schemas.microsoft.com/office/word/2010/wordml" xmlns:w15="http://schemas.microsoft.com/office/word/2012/wordml" xmlns:w16cex="http://schemas.microsoft.com/office/word/2018/wordml/cex" xmlns:w16cid="http://schemas.microsoft.com/office/word/2016/wordml/cid" xmlns:w16="http://schemas.microsoft.com/office/word/2018/wordml" xmlns:w16sdtdh="http://schemas.microsoft.com/office/word/2020/wordml/sdtdatahash" xmlns:w16se="http://schemas.microsoft.com/office/word/2015/wordml/symex" xmlns:wpg="http://schemas.microsoft.com/office/word/2010/wordprocessingGroup" xmlns:wpi="http://schemas.microsoft.com/office/word/2010/wordprocessingInk" xmlns:wne="http://schemas.microsoft.com/office/word/2006/wordml" xmlns:wps="http://schemas.microsoft.com/office/word/2010/wordprocessingShape" mc:Ignorable="w14 w15 w16se w16cid w16 w16cex w16sdtdh wp14">
   <w:endnote w:type="separator" w:id="-1">
     <w:p>
       <w:pPr>
@@ -41409,7 +41245,7 @@
 </file>
 
 <file path=word/footnotes.xml><?xml version="1.0" encoding="utf-8"?>
-<w:footnotes xmlns:wpc="http://schemas.microsoft.com/office/word/2010/wordprocessingCanvas" xmlns:cx="http://schemas.microsoft.com/office/drawing/2014/chartex" xmlns:cx1="http://schemas.microsoft.com/office/drawing/2015/9/8/chartex" xmlns:mc="http://schemas.openxmlformats.org/markup-compatibility/2006" xmlns:o="urn:schemas-microsoft-com:office:office" xmlns:r="http://schemas.openxmlformats.org/officeDocument/2006/relationships" xmlns:m="http://schemas.openxmlformats.org/officeDocument/2006/math" xmlns:v="urn:schemas-microsoft-com:vml" xmlns:wp14="http://schemas.microsoft.com/office/word/2010/wordprocessingDrawing" xmlns:wp="http://schemas.openxmlformats.org/drawingml/2006/wordprocessingDrawing" xmlns:w10="urn:schemas-microsoft-com:office:word" xmlns:w="http://schemas.openxmlformats.org/wordprocessingml/2006/main" xmlns:w14="http://schemas.microsoft.com/office/word/2010/wordml" xmlns:w15="http://schemas.microsoft.com/office/word/2012/wordml" xmlns:w16se="http://schemas.microsoft.com/office/word/2015/wordml/symex" xmlns:wpg="http://schemas.microsoft.com/office/word/2010/wordprocessingGroup" xmlns:wpi="http://schemas.microsoft.com/office/word/2010/wordprocessingInk" xmlns:wne="http://schemas.microsoft.com/office/word/2006/wordml" xmlns:wps="http://schemas.microsoft.com/office/word/2010/wordprocessingShape" mc:Ignorable="w14 w15 w16se wp14">
+<w:footnotes xmlns:wpc="http://schemas.microsoft.com/office/word/2010/wordprocessingCanvas" xmlns:cx="http://schemas.microsoft.com/office/drawing/2014/chartex" xmlns:cx1="http://schemas.microsoft.com/office/drawing/2015/9/8/chartex" xmlns:cx2="http://schemas.microsoft.com/office/drawing/2015/10/21/chartex" xmlns:cx3="http://schemas.microsoft.com/office/drawing/2016/5/9/chartex" xmlns:cx4="http://schemas.microsoft.com/office/drawing/2016/5/10/chartex" xmlns:cx5="http://schemas.microsoft.com/office/drawing/2016/5/11/chartex" xmlns:cx6="http://schemas.microsoft.com/office/drawing/2016/5/12/chartex" xmlns:cx7="http://schemas.microsoft.com/office/drawing/2016/5/13/chartex" xmlns:cx8="http://schemas.microsoft.com/office/drawing/2016/5/14/chartex" xmlns:mc="http://schemas.openxmlformats.org/markup-compatibility/2006" xmlns:aink="http://schemas.microsoft.com/office/drawing/2016/ink" xmlns:am3d="http://schemas.microsoft.com/office/drawing/2017/model3d" xmlns:o="urn:schemas-microsoft-com:office:office" xmlns:oel="http://schemas.microsoft.com/office/2019/extlst" xmlns:r="http://schemas.openxmlformats.org/officeDocument/2006/relationships" xmlns:m="http://schemas.openxmlformats.org/officeDocument/2006/math" xmlns:v="urn:schemas-microsoft-com:vml" xmlns:wp14="http://schemas.microsoft.com/office/word/2010/wordprocessingDrawing" xmlns:wp="http://schemas.openxmlformats.org/drawingml/2006/wordprocessingDrawing" xmlns:w10="urn:schemas-microsoft-com:office:word" xmlns:w="http://schemas.openxmlformats.org/wordprocessingml/2006/main" xmlns:w14="http://schemas.microsoft.com/office/word/2010/wordml" xmlns:w15="http://schemas.microsoft.com/office/word/2012/wordml" xmlns:w16cex="http://schemas.microsoft.com/office/word/2018/wordml/cex" xmlns:w16cid="http://schemas.microsoft.com/office/word/2016/wordml/cid" xmlns:w16="http://schemas.microsoft.com/office/word/2018/wordml" xmlns:w16sdtdh="http://schemas.microsoft.com/office/word/2020/wordml/sdtdatahash" xmlns:w16se="http://schemas.microsoft.com/office/word/2015/wordml/symex" xmlns:wpg="http://schemas.microsoft.com/office/word/2010/wordprocessingGroup" xmlns:wpi="http://schemas.microsoft.com/office/word/2010/wordprocessingInk" xmlns:wne="http://schemas.microsoft.com/office/word/2006/wordml" xmlns:wps="http://schemas.microsoft.com/office/word/2010/wordprocessingShape" mc:Ignorable="w14 w15 w16se w16cid w16 w16cex w16sdtdh wp14">
   <w:footnote w:type="separator" w:id="-1">
     <w:p>
       <w:pPr>
@@ -41434,7 +41270,7 @@
 </file>
 
 <file path=word/numbering.xml><?xml version="1.0" encoding="utf-8"?>
-<w:numbering xmlns:wpc="http://schemas.microsoft.com/office/word/2010/wordprocessingCanvas" xmlns:cx="http://schemas.microsoft.com/office/drawing/2014/chartex" xmlns:cx1="http://schemas.microsoft.com/office/drawing/2015/9/8/chartex" xmlns:mc="http://schemas.openxmlformats.org/markup-compatibility/2006" xmlns:o="urn:schemas-microsoft-com:office:office" xmlns:r="http://schemas.openxmlformats.org/officeDocument/2006/relationships" xmlns:m="http://schemas.openxmlformats.org/officeDocument/2006/math" xmlns:v="urn:schemas-microsoft-com:vml" xmlns:wp14="http://schemas.microsoft.com/office/word/2010/wordprocessingDrawing" xmlns:wp="http://schemas.openxmlformats.org/drawingml/2006/wordprocessingDrawing" xmlns:w10="urn:schemas-microsoft-com:office:word" xmlns:w="http://schemas.openxmlformats.org/wordprocessingml/2006/main" xmlns:w14="http://schemas.microsoft.com/office/word/2010/wordml" xmlns:w15="http://schemas.microsoft.com/office/word/2012/wordml" xmlns:w16se="http://schemas.microsoft.com/office/word/2015/wordml/symex" xmlns:wpg="http://schemas.microsoft.com/office/word/2010/wordprocessingGroup" xmlns:wpi="http://schemas.microsoft.com/office/word/2010/wordprocessingInk" xmlns:wne="http://schemas.microsoft.com/office/word/2006/wordml" xmlns:wps="http://schemas.microsoft.com/office/word/2010/wordprocessingShape" mc:Ignorable="w14 w15 w16se wp14">
+<w:numbering xmlns:wpc="http://schemas.microsoft.com/office/word/2010/wordprocessingCanvas" xmlns:cx="http://schemas.microsoft.com/office/drawing/2014/chartex" xmlns:cx1="http://schemas.microsoft.com/office/drawing/2015/9/8/chartex" xmlns:cx2="http://schemas.microsoft.com/office/drawing/2015/10/21/chartex" xmlns:cx3="http://schemas.microsoft.com/office/drawing/2016/5/9/chartex" xmlns:cx4="http://schemas.microsoft.com/office/drawing/2016/5/10/chartex" xmlns:cx5="http://schemas.microsoft.com/office/drawing/2016/5/11/chartex" xmlns:cx6="http://schemas.microsoft.com/office/drawing/2016/5/12/chartex" xmlns:cx7="http://schemas.microsoft.com/office/drawing/2016/5/13/chartex" xmlns:cx8="http://schemas.microsoft.com/office/drawing/2016/5/14/chartex" xmlns:mc="http://schemas.openxmlformats.org/markup-compatibility/2006" xmlns:aink="http://schemas.microsoft.com/office/drawing/2016/ink" xmlns:am3d="http://schemas.microsoft.com/office/drawing/2017/model3d" xmlns:o="urn:schemas-microsoft-com:office:office" xmlns:oel="http://schemas.microsoft.com/office/2019/extlst" xmlns:r="http://schemas.openxmlformats.org/officeDocument/2006/relationships" xmlns:m="http://schemas.openxmlformats.org/officeDocument/2006/math" xmlns:v="urn:schemas-microsoft-com:vml" xmlns:wp14="http://schemas.microsoft.com/office/word/2010/wordprocessingDrawing" xmlns:wp="http://schemas.openxmlformats.org/drawingml/2006/wordprocessingDrawing" xmlns:w10="urn:schemas-microsoft-com:office:word" xmlns:w="http://schemas.openxmlformats.org/wordprocessingml/2006/main" xmlns:w14="http://schemas.microsoft.com/office/word/2010/wordml" xmlns:w15="http://schemas.microsoft.com/office/word/2012/wordml" xmlns:w16cex="http://schemas.microsoft.com/office/word/2018/wordml/cex" xmlns:w16cid="http://schemas.microsoft.com/office/word/2016/wordml/cid" xmlns:w16="http://schemas.microsoft.com/office/word/2018/wordml" xmlns:w16sdtdh="http://schemas.microsoft.com/office/word/2020/wordml/sdtdatahash" xmlns:w16se="http://schemas.microsoft.com/office/word/2015/wordml/symex" xmlns:wpg="http://schemas.microsoft.com/office/word/2010/wordprocessingGroup" xmlns:wpi="http://schemas.microsoft.com/office/word/2010/wordprocessingInk" xmlns:wne="http://schemas.microsoft.com/office/word/2006/wordml" xmlns:wps="http://schemas.microsoft.com/office/word/2010/wordprocessingShape" mc:Ignorable="w14 w15 w16se w16cid w16 w16cex w16sdtdh wp14">
   <w:abstractNum w:abstractNumId="0" w15:restartNumberingAfterBreak="0">
     <w:nsid w:val="10D72B43"/>
     <w:multiLevelType w:val="hybridMultilevel"/>
@@ -41976,26 +41812,26 @@
       </w:rPr>
     </w:lvl>
   </w:abstractNum>
-  <w:num w:numId="1">
+  <w:num w:numId="1" w16cid:durableId="1794056131">
     <w:abstractNumId w:val="2"/>
   </w:num>
-  <w:num w:numId="2">
+  <w:num w:numId="2" w16cid:durableId="704522912">
     <w:abstractNumId w:val="1"/>
   </w:num>
-  <w:num w:numId="3">
+  <w:num w:numId="3" w16cid:durableId="1174413868">
     <w:abstractNumId w:val="0"/>
   </w:num>
-  <w:num w:numId="4">
+  <w:num w:numId="4" w16cid:durableId="1903711783">
     <w:abstractNumId w:val="3"/>
   </w:num>
-  <w:num w:numId="5">
+  <w:num w:numId="5" w16cid:durableId="160121092">
     <w:abstractNumId w:val="4"/>
   </w:num>
 </w:numbering>
 </file>
 
 <file path=word/styles.xml><?xml version="1.0" encoding="utf-8"?>
-<w:styles xmlns:mc="http://schemas.openxmlformats.org/markup-compatibility/2006" xmlns:r="http://schemas.openxmlformats.org/officeDocument/2006/relationships" xmlns:w="http://schemas.openxmlformats.org/wordprocessingml/2006/main" xmlns:w14="http://schemas.microsoft.com/office/word/2010/wordml" xmlns:w15="http://schemas.microsoft.com/office/word/2012/wordml" xmlns:w16se="http://schemas.microsoft.com/office/word/2015/wordml/symex" mc:Ignorable="w14 w15 w16se">
+<w:styles xmlns:mc="http://schemas.openxmlformats.org/markup-compatibility/2006" xmlns:r="http://schemas.openxmlformats.org/officeDocument/2006/relationships" xmlns:w="http://schemas.openxmlformats.org/wordprocessingml/2006/main" xmlns:w14="http://schemas.microsoft.com/office/word/2010/wordml" xmlns:w15="http://schemas.microsoft.com/office/word/2012/wordml" xmlns:w16cex="http://schemas.microsoft.com/office/word/2018/wordml/cex" xmlns:w16cid="http://schemas.microsoft.com/office/word/2016/wordml/cid" xmlns:w16="http://schemas.microsoft.com/office/word/2018/wordml" xmlns:w16sdtdh="http://schemas.microsoft.com/office/word/2020/wordml/sdtdatahash" xmlns:w16se="http://schemas.microsoft.com/office/word/2015/wordml/symex" mc:Ignorable="w14 w15 w16se w16cid w16 w16cex w16sdtdh">
   <w:docDefaults>
     <w:rPrDefault>
       <w:rPr>
@@ -42011,7 +41847,7 @@
       </w:pPr>
     </w:pPrDefault>
   </w:docDefaults>
-  <w:latentStyles w:defLockedState="0" w:defUIPriority="99" w:defSemiHidden="0" w:defUnhideWhenUsed="0" w:defQFormat="0" w:count="371">
+  <w:latentStyles w:defLockedState="0" w:defUIPriority="99" w:defSemiHidden="0" w:defUnhideWhenUsed="0" w:defQFormat="0" w:count="376">
     <w:lsdException w:name="Normal" w:uiPriority="0" w:qFormat="1"/>
     <w:lsdException w:name="heading 1" w:uiPriority="0" w:qFormat="1"/>
     <w:lsdException w:name="heading 2" w:semiHidden="1" w:uiPriority="9" w:unhideWhenUsed="1" w:qFormat="1"/>
@@ -42383,19 +42219,24 @@
     <w:lsdException w:name="List Table 5 Dark Accent 6" w:uiPriority="50"/>
     <w:lsdException w:name="List Table 6 Colorful Accent 6" w:uiPriority="51"/>
     <w:lsdException w:name="List Table 7 Colorful Accent 6" w:uiPriority="52"/>
+    <w:lsdException w:name="Mention" w:semiHidden="1" w:unhideWhenUsed="1"/>
+    <w:lsdException w:name="Smart Hyperlink" w:semiHidden="1" w:unhideWhenUsed="1"/>
+    <w:lsdException w:name="Hashtag" w:semiHidden="1" w:unhideWhenUsed="1"/>
+    <w:lsdException w:name="Unresolved Mention" w:semiHidden="1" w:unhideWhenUsed="1"/>
+    <w:lsdException w:name="Smart Link" w:semiHidden="1" w:unhideWhenUsed="1"/>
   </w:latentStyles>
-  <w:style w:type="paragraph" w:default="1" w:styleId="a">
+  <w:style w:type="paragraph" w:default="1" w:styleId="Normal">
     <w:name w:val="Normal"/>
     <w:qFormat/>
     <w:pPr>
       <w:bidi/>
     </w:pPr>
   </w:style>
-  <w:style w:type="paragraph" w:styleId="1">
+  <w:style w:type="paragraph" w:styleId="Heading1">
     <w:name w:val="heading 1"/>
-    <w:basedOn w:val="a"/>
-    <w:next w:val="a"/>
-    <w:link w:val="10"/>
+    <w:basedOn w:val="Normal"/>
+    <w:next w:val="Normal"/>
+    <w:link w:val="Heading1Char"/>
     <w:qFormat/>
     <w:rsid w:val="009E2BCC"/>
     <w:pPr>
@@ -42415,11 +42256,11 @@
       <w:lang w:eastAsia="he-IL"/>
     </w:rPr>
   </w:style>
-  <w:style w:type="paragraph" w:styleId="2">
+  <w:style w:type="paragraph" w:styleId="Heading2">
     <w:name w:val="heading 2"/>
-    <w:basedOn w:val="a"/>
-    <w:next w:val="a"/>
-    <w:link w:val="20"/>
+    <w:basedOn w:val="Normal"/>
+    <w:next w:val="Normal"/>
+    <w:link w:val="Heading2Char"/>
     <w:uiPriority w:val="9"/>
     <w:unhideWhenUsed/>
     <w:qFormat/>
@@ -42440,11 +42281,11 @@
       <w:lang w:eastAsia="he-IL"/>
     </w:rPr>
   </w:style>
-  <w:style w:type="paragraph" w:styleId="3">
+  <w:style w:type="paragraph" w:styleId="Heading3">
     <w:name w:val="heading 3"/>
-    <w:basedOn w:val="a"/>
-    <w:next w:val="a"/>
-    <w:link w:val="30"/>
+    <w:basedOn w:val="Normal"/>
+    <w:next w:val="Normal"/>
+    <w:link w:val="Heading3Char"/>
     <w:uiPriority w:val="9"/>
     <w:unhideWhenUsed/>
     <w:qFormat/>
@@ -42460,13 +42301,13 @@
       <w:u w:val="single"/>
     </w:rPr>
   </w:style>
-  <w:style w:type="character" w:default="1" w:styleId="a0">
+  <w:style w:type="character" w:default="1" w:styleId="DefaultParagraphFont">
     <w:name w:val="Default Paragraph Font"/>
     <w:uiPriority w:val="1"/>
     <w:semiHidden/>
     <w:unhideWhenUsed/>
   </w:style>
-  <w:style w:type="table" w:default="1" w:styleId="a1">
+  <w:style w:type="table" w:default="1" w:styleId="TableNormal">
     <w:name w:val="Normal Table"/>
     <w:uiPriority w:val="99"/>
     <w:semiHidden/>
@@ -42481,16 +42322,16 @@
       </w:tblCellMar>
     </w:tblPr>
   </w:style>
-  <w:style w:type="numbering" w:default="1" w:styleId="a2">
+  <w:style w:type="numbering" w:default="1" w:styleId="NoList">
     <w:name w:val="No List"/>
     <w:uiPriority w:val="99"/>
     <w:semiHidden/>
     <w:unhideWhenUsed/>
   </w:style>
-  <w:style w:type="character" w:customStyle="1" w:styleId="10">
-    <w:name w:val="כותרת 1 תו"/>
-    <w:basedOn w:val="a0"/>
-    <w:link w:val="1"/>
+  <w:style w:type="character" w:customStyle="1" w:styleId="Heading1Char">
+    <w:name w:val="Heading 1 Char"/>
+    <w:basedOn w:val="DefaultParagraphFont"/>
+    <w:link w:val="Heading1"/>
     <w:rsid w:val="009E2BCC"/>
     <w:rPr>
       <w:rFonts w:ascii="Times New Roman" w:eastAsia="Times New Roman" w:hAnsi="Times New Roman" w:cs="David"/>
@@ -42502,10 +42343,10 @@
       <w:lang w:eastAsia="he-IL"/>
     </w:rPr>
   </w:style>
-  <w:style w:type="character" w:customStyle="1" w:styleId="20">
-    <w:name w:val="כותרת 2 תו"/>
-    <w:basedOn w:val="a0"/>
-    <w:link w:val="2"/>
+  <w:style w:type="character" w:customStyle="1" w:styleId="Heading2Char">
+    <w:name w:val="Heading 2 Char"/>
+    <w:basedOn w:val="DefaultParagraphFont"/>
+    <w:link w:val="Heading2"/>
     <w:uiPriority w:val="9"/>
     <w:rsid w:val="009E2BCC"/>
     <w:rPr>
@@ -42518,10 +42359,10 @@
       <w:lang w:eastAsia="he-IL"/>
     </w:rPr>
   </w:style>
-  <w:style w:type="character" w:customStyle="1" w:styleId="30">
-    <w:name w:val="כותרת 3 תו"/>
-    <w:basedOn w:val="a0"/>
-    <w:link w:val="3"/>
+  <w:style w:type="character" w:customStyle="1" w:styleId="Heading3Char">
+    <w:name w:val="Heading 3 Char"/>
+    <w:basedOn w:val="DefaultParagraphFont"/>
+    <w:link w:val="Heading3"/>
     <w:uiPriority w:val="9"/>
     <w:rsid w:val="009E2BCC"/>
     <w:rPr>
@@ -42531,10 +42372,10 @@
       <w:u w:val="single"/>
     </w:rPr>
   </w:style>
-  <w:style w:type="paragraph" w:styleId="a3">
+  <w:style w:type="paragraph" w:styleId="EndnoteText">
     <w:name w:val="endnote text"/>
-    <w:basedOn w:val="a"/>
-    <w:link w:val="a4"/>
+    <w:basedOn w:val="Normal"/>
+    <w:link w:val="EndnoteTextChar"/>
     <w:unhideWhenUsed/>
     <w:rsid w:val="00C8763D"/>
     <w:pPr>
@@ -42547,10 +42388,10 @@
       <w:lang w:eastAsia="he-IL"/>
     </w:rPr>
   </w:style>
-  <w:style w:type="character" w:customStyle="1" w:styleId="a4">
-    <w:name w:val="טקסט הערת סיום תו"/>
-    <w:basedOn w:val="a0"/>
-    <w:link w:val="a3"/>
+  <w:style w:type="character" w:customStyle="1" w:styleId="EndnoteTextChar">
+    <w:name w:val="Endnote Text Char"/>
+    <w:basedOn w:val="DefaultParagraphFont"/>
+    <w:link w:val="EndnoteText"/>
     <w:rsid w:val="00C8763D"/>
     <w:rPr>
       <w:rFonts w:ascii="Times New Roman" w:eastAsia="Times New Roman" w:hAnsi="Times New Roman" w:cs="Times New Roman"/>
@@ -42559,7 +42400,7 @@
       <w:lang w:eastAsia="he-IL"/>
     </w:rPr>
   </w:style>
-  <w:style w:type="character" w:styleId="a5">
+  <w:style w:type="character" w:styleId="EndnoteReference">
     <w:name w:val="endnote reference"/>
     <w:unhideWhenUsed/>
     <w:rsid w:val="00C8763D"/>
@@ -42567,10 +42408,10 @@
       <w:vertAlign w:val="superscript"/>
     </w:rPr>
   </w:style>
-  <w:style w:type="paragraph" w:styleId="a6">
+  <w:style w:type="paragraph" w:styleId="FootnoteText">
     <w:name w:val="footnote text"/>
-    <w:basedOn w:val="a"/>
-    <w:link w:val="a7"/>
+    <w:basedOn w:val="Normal"/>
+    <w:link w:val="FootnoteTextChar"/>
     <w:unhideWhenUsed/>
     <w:rsid w:val="007032E5"/>
     <w:pPr>
@@ -42581,29 +42422,29 @@
       <w:szCs w:val="20"/>
     </w:rPr>
   </w:style>
-  <w:style w:type="character" w:customStyle="1" w:styleId="a7">
-    <w:name w:val="טקסט הערת שוליים תו"/>
-    <w:basedOn w:val="a0"/>
-    <w:link w:val="a6"/>
+  <w:style w:type="character" w:customStyle="1" w:styleId="FootnoteTextChar">
+    <w:name w:val="Footnote Text Char"/>
+    <w:basedOn w:val="DefaultParagraphFont"/>
+    <w:link w:val="FootnoteText"/>
     <w:rsid w:val="007032E5"/>
     <w:rPr>
       <w:sz w:val="20"/>
       <w:szCs w:val="20"/>
     </w:rPr>
   </w:style>
-  <w:style w:type="character" w:styleId="a8">
+  <w:style w:type="character" w:styleId="FootnoteReference">
     <w:name w:val="footnote reference"/>
-    <w:basedOn w:val="a0"/>
+    <w:basedOn w:val="DefaultParagraphFont"/>
     <w:unhideWhenUsed/>
     <w:rsid w:val="007032E5"/>
     <w:rPr>
       <w:vertAlign w:val="superscript"/>
     </w:rPr>
   </w:style>
-  <w:style w:type="paragraph" w:styleId="a9">
+  <w:style w:type="paragraph" w:styleId="Header">
     <w:name w:val="header"/>
-    <w:basedOn w:val="a"/>
-    <w:link w:val="aa"/>
+    <w:basedOn w:val="Normal"/>
+    <w:link w:val="HeaderChar"/>
     <w:uiPriority w:val="99"/>
     <w:rsid w:val="002006FE"/>
     <w:pPr>
@@ -42619,10 +42460,10 @@
       <w:szCs w:val="24"/>
     </w:rPr>
   </w:style>
-  <w:style w:type="character" w:customStyle="1" w:styleId="aa">
-    <w:name w:val="כותרת עליונה תו"/>
-    <w:basedOn w:val="a0"/>
-    <w:link w:val="a9"/>
+  <w:style w:type="character" w:customStyle="1" w:styleId="HeaderChar">
+    <w:name w:val="Header Char"/>
+    <w:basedOn w:val="DefaultParagraphFont"/>
+    <w:link w:val="Header"/>
     <w:uiPriority w:val="99"/>
     <w:rsid w:val="002006FE"/>
     <w:rPr>
@@ -42631,10 +42472,10 @@
       <w:szCs w:val="24"/>
     </w:rPr>
   </w:style>
-  <w:style w:type="paragraph" w:styleId="ab">
+  <w:style w:type="paragraph" w:styleId="Footer">
     <w:name w:val="footer"/>
-    <w:basedOn w:val="a"/>
-    <w:link w:val="ac"/>
+    <w:basedOn w:val="Normal"/>
+    <w:link w:val="FooterChar"/>
     <w:uiPriority w:val="99"/>
     <w:rsid w:val="002006FE"/>
     <w:pPr>
@@ -42650,10 +42491,10 @@
       <w:szCs w:val="24"/>
     </w:rPr>
   </w:style>
-  <w:style w:type="character" w:customStyle="1" w:styleId="ac">
-    <w:name w:val="כותרת תחתונה תו"/>
-    <w:basedOn w:val="a0"/>
-    <w:link w:val="ab"/>
+  <w:style w:type="character" w:customStyle="1" w:styleId="FooterChar">
+    <w:name w:val="Footer Char"/>
+    <w:basedOn w:val="DefaultParagraphFont"/>
+    <w:link w:val="Footer"/>
     <w:uiPriority w:val="99"/>
     <w:rsid w:val="002006FE"/>
     <w:rPr>
@@ -42662,9 +42503,9 @@
       <w:szCs w:val="24"/>
     </w:rPr>
   </w:style>
-  <w:style w:type="table" w:styleId="ad">
+  <w:style w:type="table" w:styleId="TableGrid">
     <w:name w:val="Table Grid"/>
-    <w:basedOn w:val="a1"/>
+    <w:basedOn w:val="TableNormal"/>
     <w:rsid w:val="002006FE"/>
     <w:pPr>
       <w:bidi/>
@@ -42686,10 +42527,10 @@
       </w:tblBorders>
     </w:tblPr>
   </w:style>
-  <w:style w:type="paragraph" w:styleId="ae">
+  <w:style w:type="paragraph" w:styleId="BalloonText">
     <w:name w:val="Balloon Text"/>
-    <w:basedOn w:val="a"/>
-    <w:link w:val="af"/>
+    <w:basedOn w:val="Normal"/>
+    <w:link w:val="BalloonTextChar"/>
     <w:rsid w:val="002006FE"/>
     <w:pPr>
       <w:spacing w:after="0" w:line="240" w:lineRule="auto"/>
@@ -42700,10 +42541,10 @@
       <w:szCs w:val="16"/>
     </w:rPr>
   </w:style>
-  <w:style w:type="character" w:customStyle="1" w:styleId="af">
-    <w:name w:val="טקסט בלונים תו"/>
-    <w:basedOn w:val="a0"/>
-    <w:link w:val="ae"/>
+  <w:style w:type="character" w:customStyle="1" w:styleId="BalloonTextChar">
+    <w:name w:val="Balloon Text Char"/>
+    <w:basedOn w:val="DefaultParagraphFont"/>
+    <w:link w:val="BalloonText"/>
     <w:rsid w:val="002006FE"/>
     <w:rPr>
       <w:rFonts w:ascii="Tahoma" w:eastAsia="Times New Roman" w:hAnsi="Tahoma" w:cs="Tahoma"/>
@@ -42711,9 +42552,9 @@
       <w:szCs w:val="16"/>
     </w:rPr>
   </w:style>
-  <w:style w:type="paragraph" w:styleId="af0">
+  <w:style w:type="paragraph" w:styleId="ListParagraph">
     <w:name w:val="List Paragraph"/>
-    <w:basedOn w:val="a"/>
+    <w:basedOn w:val="Normal"/>
     <w:uiPriority w:val="34"/>
     <w:qFormat/>
     <w:rsid w:val="002006FE"/>
@@ -42728,9 +42569,9 @@
       <w:szCs w:val="24"/>
     </w:rPr>
   </w:style>
-  <w:style w:type="character" w:styleId="af1">
+  <w:style w:type="character" w:styleId="Strong">
     <w:name w:val="Strong"/>
-    <w:basedOn w:val="a0"/>
+    <w:basedOn w:val="DefaultParagraphFont"/>
     <w:uiPriority w:val="22"/>
     <w:qFormat/>
     <w:rsid w:val="00CB4975"/>
@@ -42741,8 +42582,8 @@
   </w:style>
   <w:style w:type="paragraph" w:styleId="TOC1">
     <w:name w:val="toc 1"/>
-    <w:basedOn w:val="a"/>
-    <w:next w:val="a"/>
+    <w:basedOn w:val="Normal"/>
+    <w:next w:val="Normal"/>
     <w:autoRedefine/>
     <w:uiPriority w:val="39"/>
     <w:unhideWhenUsed/>
@@ -42753,8 +42594,8 @@
   </w:style>
   <w:style w:type="paragraph" w:styleId="TOC4">
     <w:name w:val="toc 4"/>
-    <w:basedOn w:val="a"/>
-    <w:next w:val="a"/>
+    <w:basedOn w:val="Normal"/>
+    <w:next w:val="Normal"/>
     <w:autoRedefine/>
     <w:uiPriority w:val="39"/>
     <w:unhideWhenUsed/>
@@ -42766,8 +42607,8 @@
   </w:style>
   <w:style w:type="paragraph" w:styleId="TOC7">
     <w:name w:val="toc 7"/>
-    <w:basedOn w:val="a"/>
-    <w:next w:val="a"/>
+    <w:basedOn w:val="Normal"/>
+    <w:next w:val="Normal"/>
     <w:autoRedefine/>
     <w:uiPriority w:val="39"/>
     <w:semiHidden/>
@@ -42780,8 +42621,8 @@
   </w:style>
   <w:style w:type="paragraph" w:styleId="TOC2">
     <w:name w:val="toc 2"/>
-    <w:basedOn w:val="a"/>
-    <w:next w:val="a"/>
+    <w:basedOn w:val="Normal"/>
+    <w:next w:val="Normal"/>
     <w:autoRedefine/>
     <w:uiPriority w:val="39"/>
     <w:unhideWhenUsed/>
@@ -42793,8 +42634,8 @@
   </w:style>
   <w:style w:type="paragraph" w:styleId="TOC3">
     <w:name w:val="toc 3"/>
-    <w:basedOn w:val="a"/>
-    <w:next w:val="a"/>
+    <w:basedOn w:val="Normal"/>
+    <w:next w:val="Normal"/>
     <w:autoRedefine/>
     <w:uiPriority w:val="39"/>
     <w:unhideWhenUsed/>
@@ -42806,7 +42647,7 @@
   </w:style>
   <w:style w:type="character" w:styleId="Hyperlink">
     <w:name w:val="Hyperlink"/>
-    <w:basedOn w:val="a0"/>
+    <w:basedOn w:val="DefaultParagraphFont"/>
     <w:uiPriority w:val="99"/>
     <w:unhideWhenUsed/>
     <w:rsid w:val="00E57C55"/>
@@ -42817,7 +42658,7 @@
   </w:style>
   <w:style w:type="paragraph" w:customStyle="1" w:styleId="Normal1">
     <w:name w:val="Normal1"/>
-    <w:basedOn w:val="2"/>
+    <w:basedOn w:val="Heading2"/>
     <w:link w:val="Normal10"/>
     <w:rsid w:val="003520E8"/>
     <w:pPr>
@@ -42832,7 +42673,7 @@
   </w:style>
   <w:style w:type="character" w:customStyle="1" w:styleId="Normal10">
     <w:name w:val="Normal1 תו"/>
-    <w:basedOn w:val="20"/>
+    <w:basedOn w:val="Heading2Char"/>
     <w:link w:val="Normal1"/>
     <w:rsid w:val="003520E8"/>
     <w:rPr>
@@ -42847,7 +42688,7 @@
   </w:style>
   <w:style w:type="paragraph" w:customStyle="1" w:styleId="Normal2">
     <w:name w:val="Normal2"/>
-    <w:basedOn w:val="2"/>
+    <w:basedOn w:val="Heading2"/>
     <w:link w:val="Normal20"/>
     <w:rsid w:val="003520E8"/>
     <w:pPr>
@@ -42862,7 +42703,7 @@
   </w:style>
   <w:style w:type="character" w:customStyle="1" w:styleId="Normal20">
     <w:name w:val="Normal2 תו"/>
-    <w:basedOn w:val="20"/>
+    <w:basedOn w:val="Heading2Char"/>
     <w:link w:val="Normal2"/>
     <w:rsid w:val="003520E8"/>
     <w:rPr>
@@ -42877,7 +42718,7 @@
   </w:style>
   <w:style w:type="paragraph" w:customStyle="1" w:styleId="Normal3">
     <w:name w:val="Normal3"/>
-    <w:basedOn w:val="3"/>
+    <w:basedOn w:val="Heading3"/>
     <w:link w:val="Normal30"/>
     <w:rsid w:val="006C0AA4"/>
     <w:pPr>
@@ -42892,7 +42733,7 @@
   </w:style>
   <w:style w:type="character" w:customStyle="1" w:styleId="Normal30">
     <w:name w:val="Normal3 תו"/>
-    <w:basedOn w:val="30"/>
+    <w:basedOn w:val="Heading3Char"/>
     <w:link w:val="Normal3"/>
     <w:rsid w:val="006C0AA4"/>
     <w:rPr>
@@ -42905,7 +42746,7 @@
   </w:style>
   <w:style w:type="paragraph" w:customStyle="1" w:styleId="Normal4">
     <w:name w:val="Normal4"/>
-    <w:basedOn w:val="3"/>
+    <w:basedOn w:val="Heading3"/>
     <w:link w:val="Normal40"/>
     <w:rsid w:val="00272B9A"/>
     <w:pPr>
@@ -42920,7 +42761,7 @@
   </w:style>
   <w:style w:type="character" w:customStyle="1" w:styleId="Normal40">
     <w:name w:val="Normal4 תו"/>
-    <w:basedOn w:val="30"/>
+    <w:basedOn w:val="Heading3Char"/>
     <w:link w:val="Normal4"/>
     <w:rsid w:val="00272B9A"/>
     <w:rPr>
@@ -43220,15 +43061,35 @@
 </file>
 
 <file path=customXml/item1.xml><?xml version="1.0" encoding="utf-8"?>
-<?mso-contentType ?>
-<FormTemplates xmlns="http://schemas.microsoft.com/sharepoint/v3/contenttype/forms">
-  <Display>DocumentLibraryForm</Display>
-  <Edit>DocumentLibraryForm</Edit>
-  <New>DocumentLibraryForm</New>
-</FormTemplates>
+<b:Sources xmlns:b="http://schemas.openxmlformats.org/officeDocument/2006/bibliography" xmlns="http://schemas.openxmlformats.org/officeDocument/2006/bibliography" SelectedStyle="\APA.XSL" StyleName="APA"/>
 </file>
 
 <file path=customXml/item2.xml><?xml version="1.0" encoding="utf-8"?>
+<p:properties xmlns:p="http://schemas.microsoft.com/office/2006/metadata/properties" xmlns:xsi="http://www.w3.org/2001/XMLSchema-instance" xmlns:pc="http://schemas.microsoft.com/office/infopath/2007/PartnerControls">
+  <documentManagement>
+    <GovXEventDate xmlns="605e85f2-268e-450d-9afb-d305d42b267e">2020-02-24T22:00:00+00:00</GovXEventDate>
+    <GovXID xmlns="605e85f2-268e-450d-9afb-d305d42b267e">0.02</GovXID>
+    <MMDSubjectsTaxHTField0 xmlns="605e85f2-268e-450d-9afb-d305d42b267e">לשכות רישום המקרקעין|926e03f4-90a0-4c4c-811b-280e25363809</MMDSubjectsTaxHTField0>
+    <MMDKeywordsTaxHTField0 xmlns="605e85f2-268e-450d-9afb-d305d42b267e" xsi:nil="true"/>
+    <MMDResponsibleUnitTaxHTField0 xmlns="605e85f2-268e-450d-9afb-d305d42b267e" xsi:nil="true"/>
+    <MMDAudienceTaxHTField0 xmlns="605e85f2-268e-450d-9afb-d305d42b267e" xsi:nil="true"/>
+    <MMDStatusTaxHTField0 xmlns="605e85f2-268e-450d-9afb-d305d42b267e" xsi:nil="true"/>
+    <MMDUnitsNameTaxHTField0 xmlns="605e85f2-268e-450d-9afb-d305d42b267e">לשכות רישום מקרקעין|a96989a1-f359-4668-bf9f-d53918f67bbc</MMDUnitsNameTaxHTField0>
+    <MMDResponsibleOfficeTaxHTField0 xmlns="605e85f2-268e-450d-9afb-d305d42b267e" xsi:nil="true"/>
+    <MMDTypesTaxHTField0 xmlns="605e85f2-268e-450d-9afb-d305d42b267e" xsi:nil="true"/>
+    <e92ea0370867458c9a8635897d3d1f43 xmlns="605e85f2-268e-450d-9afb-d305d42b267e" xsi:nil="true"/>
+    <TaxCatchAll xmlns="605e85f2-268e-450d-9afb-d305d42b267e">
+      <Value>1242</Value>
+      <Value>1532</Value>
+    </TaxCatchAll>
+    <cont xmlns="06e7b712-ee21-4cf6-83c6-341f0118a96c">13</cont>
+    <Name1 xmlns="06e7b712-ee21-4cf6-83c6-341f0118a96c">שטר מכר-הגשה ידנית ומקוונת</Name1>
+    <GovXShortDescription xmlns="605e85f2-268e-450d-9afb-d305d42b267e" xsi:nil="true"/>
+  </documentManagement>
+</p:properties>
+</file>
+
+<file path=customXml/item3.xml><?xml version="1.0" encoding="utf-8"?>
 <ct:contentTypeSchema xmlns:ct="http://schemas.microsoft.com/office/2006/metadata/contentType" xmlns:ma="http://schemas.microsoft.com/office/2006/metadata/properties/metaAttributes" ct:_="" ma:_="" ma:contentTypeName="מסמך" ma:contentTypeID="0x0101003F174188032EEF46A320EC3B24DD16AE" ma:contentTypeVersion="16" ma:contentTypeDescription="צור מסמך חדש." ma:contentTypeScope="" ma:versionID="858abcdf229c9fb4989bf1460472417a">
   <xsd:schema xmlns:xsd="http://www.w3.org/2001/XMLSchema" xmlns:xs="http://www.w3.org/2001/XMLSchema" xmlns:p="http://schemas.microsoft.com/office/2006/metadata/properties" xmlns:ns2="06e7b712-ee21-4cf6-83c6-341f0118a96c" xmlns:ns3="605e85f2-268e-450d-9afb-d305d42b267e" targetNamespace="http://schemas.microsoft.com/office/2006/metadata/properties" ma:root="true" ma:fieldsID="3ddccc5d57b52e1b46a5b2cf57ef75b6" ns2:_="" ns3:_="">
     <xsd:import namespace="06e7b712-ee21-4cf6-83c6-341f0118a96c"/>
@@ -43451,44 +43312,35 @@
 </ct:contentTypeSchema>
 </file>
 
-<file path=customXml/item3.xml><?xml version="1.0" encoding="utf-8"?>
-<p:properties xmlns:p="http://schemas.microsoft.com/office/2006/metadata/properties" xmlns:xsi="http://www.w3.org/2001/XMLSchema-instance" xmlns:pc="http://schemas.microsoft.com/office/infopath/2007/PartnerControls">
-  <documentManagement>
-    <GovXEventDate xmlns="605e85f2-268e-450d-9afb-d305d42b267e">2020-02-24T22:00:00+00:00</GovXEventDate>
-    <GovXID xmlns="605e85f2-268e-450d-9afb-d305d42b267e">0.02</GovXID>
-    <MMDSubjectsTaxHTField0 xmlns="605e85f2-268e-450d-9afb-d305d42b267e">לשכות רישום המקרקעין|926e03f4-90a0-4c4c-811b-280e25363809</MMDSubjectsTaxHTField0>
-    <MMDKeywordsTaxHTField0 xmlns="605e85f2-268e-450d-9afb-d305d42b267e" xsi:nil="true"/>
-    <MMDResponsibleUnitTaxHTField0 xmlns="605e85f2-268e-450d-9afb-d305d42b267e" xsi:nil="true"/>
-    <MMDAudienceTaxHTField0 xmlns="605e85f2-268e-450d-9afb-d305d42b267e" xsi:nil="true"/>
-    <MMDStatusTaxHTField0 xmlns="605e85f2-268e-450d-9afb-d305d42b267e" xsi:nil="true"/>
-    <MMDUnitsNameTaxHTField0 xmlns="605e85f2-268e-450d-9afb-d305d42b267e">לשכות רישום מקרקעין|a96989a1-f359-4668-bf9f-d53918f67bbc</MMDUnitsNameTaxHTField0>
-    <MMDResponsibleOfficeTaxHTField0 xmlns="605e85f2-268e-450d-9afb-d305d42b267e" xsi:nil="true"/>
-    <MMDTypesTaxHTField0 xmlns="605e85f2-268e-450d-9afb-d305d42b267e" xsi:nil="true"/>
-    <e92ea0370867458c9a8635897d3d1f43 xmlns="605e85f2-268e-450d-9afb-d305d42b267e" xsi:nil="true"/>
-    <TaxCatchAll xmlns="605e85f2-268e-450d-9afb-d305d42b267e">
-      <Value>1242</Value>
-      <Value>1532</Value>
-    </TaxCatchAll>
-    <cont xmlns="06e7b712-ee21-4cf6-83c6-341f0118a96c">13</cont>
-    <Name1 xmlns="06e7b712-ee21-4cf6-83c6-341f0118a96c">שטר מכר-הגשה ידנית ומקוונת</Name1>
-    <GovXShortDescription xmlns="605e85f2-268e-450d-9afb-d305d42b267e" xsi:nil="true"/>
-  </documentManagement>
-</p:properties>
-</file>
-
 <file path=customXml/item4.xml><?xml version="1.0" encoding="utf-8"?>
-<b:Sources xmlns:b="http://schemas.openxmlformats.org/officeDocument/2006/bibliography" xmlns="http://schemas.openxmlformats.org/officeDocument/2006/bibliography" SelectedStyle="\APA.XSL" StyleName="APA"/>
+<?mso-contentType ?>
+<FormTemplates xmlns="http://schemas.microsoft.com/sharepoint/v3/contenttype/forms">
+  <Display>DocumentLibraryForm</Display>
+  <Edit>DocumentLibraryForm</Edit>
+  <New>DocumentLibraryForm</New>
+</FormTemplates>
 </file>
 
 <file path=customXml/itemProps1.xml><?xml version="1.0" encoding="utf-8"?>
-<ds:datastoreItem xmlns:ds="http://schemas.openxmlformats.org/officeDocument/2006/customXml" ds:itemID="{BC8EC851-A9F8-46EA-929D-A3FBE2C8730F}">
+<ds:datastoreItem xmlns:ds="http://schemas.openxmlformats.org/officeDocument/2006/customXml" ds:itemID="{FD586250-5891-4F5C-B590-0DE1B40AD009}">
   <ds:schemaRefs>
-    <ds:schemaRef ds:uri="http://schemas.microsoft.com/sharepoint/v3/contenttype/forms"/>
+    <ds:schemaRef ds:uri="http://schemas.openxmlformats.org/officeDocument/2006/bibliography"/>
   </ds:schemaRefs>
 </ds:datastoreItem>
 </file>
 
 <file path=customXml/itemProps2.xml><?xml version="1.0" encoding="utf-8"?>
+<ds:datastoreItem xmlns:ds="http://schemas.openxmlformats.org/officeDocument/2006/customXml" ds:itemID="{F9ED4C05-E680-4BC2-BFB0-5DBC704B0DC9}">
+  <ds:schemaRefs>
+    <ds:schemaRef ds:uri="http://schemas.microsoft.com/office/2006/metadata/properties"/>
+    <ds:schemaRef ds:uri="http://schemas.microsoft.com/office/infopath/2007/PartnerControls"/>
+    <ds:schemaRef ds:uri="605e85f2-268e-450d-9afb-d305d42b267e"/>
+    <ds:schemaRef ds:uri="06e7b712-ee21-4cf6-83c6-341f0118a96c"/>
+  </ds:schemaRefs>
+</ds:datastoreItem>
+</file>
+
+<file path=customXml/itemProps3.xml><?xml version="1.0" encoding="utf-8"?>
 <ds:datastoreItem xmlns:ds="http://schemas.openxmlformats.org/officeDocument/2006/customXml" ds:itemID="{466C0CD1-4AF5-4891-BAC8-7CB1F1E4BA75}">
   <ds:schemaRefs>
     <ds:schemaRef ds:uri="http://schemas.microsoft.com/office/2006/metadata/contentType"/>
@@ -43507,21 +43359,10 @@
 </ds:datastoreItem>
 </file>
 
-<file path=customXml/itemProps3.xml><?xml version="1.0" encoding="utf-8"?>
-<ds:datastoreItem xmlns:ds="http://schemas.openxmlformats.org/officeDocument/2006/customXml" ds:itemID="{F9ED4C05-E680-4BC2-BFB0-5DBC704B0DC9}">
+<file path=customXml/itemProps4.xml><?xml version="1.0" encoding="utf-8"?>
+<ds:datastoreItem xmlns:ds="http://schemas.openxmlformats.org/officeDocument/2006/customXml" ds:itemID="{BC8EC851-A9F8-46EA-929D-A3FBE2C8730F}">
   <ds:schemaRefs>
-    <ds:schemaRef ds:uri="http://schemas.microsoft.com/office/2006/metadata/properties"/>
-    <ds:schemaRef ds:uri="http://schemas.microsoft.com/office/infopath/2007/PartnerControls"/>
-    <ds:schemaRef ds:uri="605e85f2-268e-450d-9afb-d305d42b267e"/>
-    <ds:schemaRef ds:uri="06e7b712-ee21-4cf6-83c6-341f0118a96c"/>
-  </ds:schemaRefs>
-</ds:datastoreItem>
-</file>
-
-<file path=customXml/itemProps4.xml><?xml version="1.0" encoding="utf-8"?>
-<ds:datastoreItem xmlns:ds="http://schemas.openxmlformats.org/officeDocument/2006/customXml" ds:itemID="{FD586250-5891-4F5C-B590-0DE1B40AD009}">
-  <ds:schemaRefs>
-    <ds:schemaRef ds:uri="http://schemas.openxmlformats.org/officeDocument/2006/bibliography"/>
+    <ds:schemaRef ds:uri="http://schemas.microsoft.com/sharepoint/v3/contenttype/forms"/>
   </ds:schemaRefs>
 </ds:datastoreItem>
 </file>
</xml_diff>